<commit_message>
Add Rook movement logic and MarkValidRookMoves method
</commit_message>
<xml_diff>
--- a/Activity 2.docx
+++ b/Activity 2.docx
@@ -409,7 +409,6 @@
           <w:szCs w:val="24"/>
         </w:rPr>
       </w:pPr>
-      <w:proofErr w:type="spellStart"/>
       <w:r>
         <w:rPr>
           <w:b/>
@@ -417,17 +416,7 @@
           <w:sz w:val="24"/>
           <w:szCs w:val="24"/>
         </w:rPr>
-        <w:t>Github</w:t>
-      </w:r>
-      <w:proofErr w:type="spellEnd"/>
-      <w:r>
-        <w:rPr>
-          <w:b/>
-          <w:bCs/>
-          <w:sz w:val="24"/>
-          <w:szCs w:val="24"/>
-        </w:rPr>
-        <w:t xml:space="preserve"> Link:</w:t>
+        <w:t>Github Link:</w:t>
       </w:r>
       <w:r>
         <w:rPr>
@@ -500,6 +489,548 @@
           <w:szCs w:val="24"/>
         </w:rPr>
         <w:t>.</w:t>
+      </w:r>
+    </w:p>
+    <w:p>
+      <w:pPr>
+        <w:rPr>
+          <w:b/>
+          <w:bCs/>
+          <w:sz w:val="24"/>
+          <w:szCs w:val="24"/>
+        </w:rPr>
+      </w:pPr>
+    </w:p>
+    <w:p>
+      <w:pPr>
+        <w:rPr>
+          <w:sz w:val="24"/>
+          <w:szCs w:val="24"/>
+        </w:rPr>
+      </w:pPr>
+      <w:r>
+        <w:rPr>
+          <w:sz w:val="24"/>
+          <w:szCs w:val="24"/>
+        </w:rPr>
+        <w:t>·Take a screenshot of the citations for CellModel, BoardModel, and BoardLogic. Make sure to include the class declarations in the images.</w:t>
+      </w:r>
+    </w:p>
+    <w:p>
+      <w:pPr>
+        <w:rPr>
+          <w:b/>
+          <w:bCs/>
+          <w:sz w:val="24"/>
+          <w:szCs w:val="24"/>
+        </w:rPr>
+      </w:pPr>
+    </w:p>
+    <w:p>
+      <w:pPr>
+        <w:pStyle w:val="PlainText"/>
+        <w:rPr>
+          <w:rFonts w:ascii="Times New Roman" w:eastAsia="Calibri" w:hAnsi="Times New Roman" w:cs="Times New Roman"/>
+          <w:bCs/>
+          <w:sz w:val="24"/>
+          <w:szCs w:val="24"/>
+        </w:rPr>
+      </w:pPr>
+      <w:r>
+        <w:rPr>
+          <w:rFonts w:ascii="Times New Roman" w:eastAsia="Calibri" w:hAnsi="Times New Roman" w:cs="Times New Roman"/>
+          <w:bCs/>
+          <w:sz w:val="24"/>
+          <w:szCs w:val="24"/>
+        </w:rPr>
+        <w:drawing>
+          <wp:inline distT="0" distB="0" distL="0" distR="0" wp14:anchorId="755AE946" wp14:editId="3BB425A1">
+            <wp:extent cx="3915321" cy="1733792"/>
+            <wp:effectExtent l="0" t="0" r="9525" b="0"/>
+            <wp:docPr id="1242582609" name="Picture 1"/>
+            <wp:cNvGraphicFramePr>
+              <a:graphicFrameLocks xmlns:a="http://schemas.openxmlformats.org/drawingml/2006/main" noChangeAspect="1"/>
+            </wp:cNvGraphicFramePr>
+            <a:graphic xmlns:a="http://schemas.openxmlformats.org/drawingml/2006/main">
+              <a:graphicData uri="http://schemas.openxmlformats.org/drawingml/2006/picture">
+                <pic:pic xmlns:pic="http://schemas.openxmlformats.org/drawingml/2006/picture">
+                  <pic:nvPicPr>
+                    <pic:cNvPr id="1242582609" name=""/>
+                    <pic:cNvPicPr/>
+                  </pic:nvPicPr>
+                  <pic:blipFill>
+                    <a:blip r:embed="rId6"/>
+                    <a:stretch>
+                      <a:fillRect/>
+                    </a:stretch>
+                  </pic:blipFill>
+                  <pic:spPr>
+                    <a:xfrm>
+                      <a:off x="0" y="0"/>
+                      <a:ext cx="3915321" cy="1733792"/>
+                    </a:xfrm>
+                    <a:prstGeom prst="rect">
+                      <a:avLst/>
+                    </a:prstGeom>
+                  </pic:spPr>
+                </pic:pic>
+              </a:graphicData>
+            </a:graphic>
+          </wp:inline>
+        </w:drawing>
+      </w:r>
+    </w:p>
+    <w:p>
+      <w:pPr>
+        <w:pStyle w:val="PlainText"/>
+        <w:rPr>
+          <w:rFonts w:ascii="Times New Roman" w:eastAsia="Calibri" w:hAnsi="Times New Roman" w:cs="Times New Roman"/>
+          <w:bCs/>
+          <w:sz w:val="24"/>
+          <w:szCs w:val="24"/>
+        </w:rPr>
+      </w:pPr>
+    </w:p>
+    <w:p>
+      <w:pPr>
+        <w:pStyle w:val="PlainText"/>
+        <w:rPr>
+          <w:rFonts w:ascii="Times New Roman" w:eastAsia="Calibri" w:hAnsi="Times New Roman" w:cs="Times New Roman"/>
+          <w:bCs/>
+          <w:sz w:val="24"/>
+          <w:szCs w:val="24"/>
+        </w:rPr>
+      </w:pPr>
+      <w:r>
+        <w:rPr>
+          <w:rFonts w:ascii="Times New Roman" w:eastAsia="Calibri" w:hAnsi="Times New Roman" w:cs="Times New Roman"/>
+          <w:bCs/>
+          <w:sz w:val="24"/>
+          <w:szCs w:val="24"/>
+        </w:rPr>
+        <w:drawing>
+          <wp:inline distT="0" distB="0" distL="0" distR="0" wp14:anchorId="310515E9" wp14:editId="4E53C691">
+            <wp:extent cx="3924300" cy="1566278"/>
+            <wp:effectExtent l="0" t="0" r="0" b="0"/>
+            <wp:docPr id="468901761" name="Picture 1"/>
+            <wp:cNvGraphicFramePr>
+              <a:graphicFrameLocks xmlns:a="http://schemas.openxmlformats.org/drawingml/2006/main" noChangeAspect="1"/>
+            </wp:cNvGraphicFramePr>
+            <a:graphic xmlns:a="http://schemas.openxmlformats.org/drawingml/2006/main">
+              <a:graphicData uri="http://schemas.openxmlformats.org/drawingml/2006/picture">
+                <pic:pic xmlns:pic="http://schemas.openxmlformats.org/drawingml/2006/picture">
+                  <pic:nvPicPr>
+                    <pic:cNvPr id="468901761" name=""/>
+                    <pic:cNvPicPr/>
+                  </pic:nvPicPr>
+                  <pic:blipFill>
+                    <a:blip r:embed="rId7"/>
+                    <a:stretch>
+                      <a:fillRect/>
+                    </a:stretch>
+                  </pic:blipFill>
+                  <pic:spPr>
+                    <a:xfrm>
+                      <a:off x="0" y="0"/>
+                      <a:ext cx="3935211" cy="1570633"/>
+                    </a:xfrm>
+                    <a:prstGeom prst="rect">
+                      <a:avLst/>
+                    </a:prstGeom>
+                  </pic:spPr>
+                </pic:pic>
+              </a:graphicData>
+            </a:graphic>
+          </wp:inline>
+        </w:drawing>
+      </w:r>
+    </w:p>
+    <w:p>
+      <w:pPr>
+        <w:pStyle w:val="PlainText"/>
+        <w:rPr>
+          <w:rFonts w:ascii="Times New Roman" w:eastAsia="Calibri" w:hAnsi="Times New Roman" w:cs="Times New Roman"/>
+          <w:bCs/>
+          <w:sz w:val="24"/>
+          <w:szCs w:val="24"/>
+        </w:rPr>
+      </w:pPr>
+    </w:p>
+    <w:p>
+      <w:pPr>
+        <w:pStyle w:val="PlainText"/>
+        <w:rPr>
+          <w:rFonts w:ascii="Times New Roman" w:eastAsia="Calibri" w:hAnsi="Times New Roman" w:cs="Times New Roman"/>
+          <w:bCs/>
+          <w:sz w:val="24"/>
+          <w:szCs w:val="24"/>
+        </w:rPr>
+      </w:pPr>
+    </w:p>
+    <w:p>
+      <w:pPr>
+        <w:pStyle w:val="PlainText"/>
+        <w:rPr>
+          <w:rFonts w:ascii="Times New Roman" w:eastAsia="Calibri" w:hAnsi="Times New Roman" w:cs="Times New Roman"/>
+          <w:bCs/>
+          <w:sz w:val="24"/>
+          <w:szCs w:val="24"/>
+        </w:rPr>
+      </w:pPr>
+      <w:r>
+        <w:rPr>
+          <w:rFonts w:ascii="Times New Roman" w:eastAsia="Calibri" w:hAnsi="Times New Roman" w:cs="Times New Roman"/>
+          <w:bCs/>
+          <w:sz w:val="24"/>
+          <w:szCs w:val="24"/>
+        </w:rPr>
+        <w:lastRenderedPageBreak/>
+        <w:drawing>
+          <wp:inline distT="0" distB="0" distL="0" distR="0" wp14:anchorId="586669EB" wp14:editId="2F826EED">
+            <wp:extent cx="3625850" cy="1506013"/>
+            <wp:effectExtent l="0" t="0" r="0" b="0"/>
+            <wp:docPr id="850010302" name="Picture 1"/>
+            <wp:cNvGraphicFramePr>
+              <a:graphicFrameLocks xmlns:a="http://schemas.openxmlformats.org/drawingml/2006/main" noChangeAspect="1"/>
+            </wp:cNvGraphicFramePr>
+            <a:graphic xmlns:a="http://schemas.openxmlformats.org/drawingml/2006/main">
+              <a:graphicData uri="http://schemas.openxmlformats.org/drawingml/2006/picture">
+                <pic:pic xmlns:pic="http://schemas.openxmlformats.org/drawingml/2006/picture">
+                  <pic:nvPicPr>
+                    <pic:cNvPr id="850010302" name=""/>
+                    <pic:cNvPicPr/>
+                  </pic:nvPicPr>
+                  <pic:blipFill>
+                    <a:blip r:embed="rId8"/>
+                    <a:stretch>
+                      <a:fillRect/>
+                    </a:stretch>
+                  </pic:blipFill>
+                  <pic:spPr>
+                    <a:xfrm>
+                      <a:off x="0" y="0"/>
+                      <a:ext cx="3641639" cy="1512571"/>
+                    </a:xfrm>
+                    <a:prstGeom prst="rect">
+                      <a:avLst/>
+                    </a:prstGeom>
+                  </pic:spPr>
+                </pic:pic>
+              </a:graphicData>
+            </a:graphic>
+          </wp:inline>
+        </w:drawing>
+      </w:r>
+    </w:p>
+    <w:p>
+      <w:pPr>
+        <w:pStyle w:val="PlainText"/>
+        <w:rPr>
+          <w:rFonts w:ascii="Times New Roman" w:eastAsia="Calibri" w:hAnsi="Times New Roman" w:cs="Times New Roman"/>
+          <w:bCs/>
+          <w:sz w:val="24"/>
+          <w:szCs w:val="24"/>
+        </w:rPr>
+      </w:pPr>
+    </w:p>
+    <w:p>
+      <w:pPr>
+        <w:rPr>
+          <w:sz w:val="24"/>
+          <w:szCs w:val="24"/>
+        </w:rPr>
+      </w:pPr>
+      <w:r>
+        <w:rPr>
+          <w:sz w:val="24"/>
+          <w:szCs w:val="24"/>
+        </w:rPr>
+        <w:t>·Take a screenshot of the CellModel and BoardModel constructors and InitializeBoard method in the BoardModel class.</w:t>
+      </w:r>
+    </w:p>
+    <w:p>
+      <w:pPr>
+        <w:rPr>
+          <w:sz w:val="24"/>
+          <w:szCs w:val="24"/>
+        </w:rPr>
+      </w:pPr>
+      <w:r>
+        <w:rPr>
+          <w:sz w:val="24"/>
+          <w:szCs w:val="24"/>
+        </w:rPr>
+        <w:drawing>
+          <wp:inline distT="0" distB="0" distL="0" distR="0" wp14:anchorId="7E1EF9B8" wp14:editId="6D9866A0">
+            <wp:extent cx="3676650" cy="2083435"/>
+            <wp:effectExtent l="0" t="0" r="0" b="0"/>
+            <wp:docPr id="249881189" name="Picture 1"/>
+            <wp:cNvGraphicFramePr>
+              <a:graphicFrameLocks xmlns:a="http://schemas.openxmlformats.org/drawingml/2006/main" noChangeAspect="1"/>
+            </wp:cNvGraphicFramePr>
+            <a:graphic xmlns:a="http://schemas.openxmlformats.org/drawingml/2006/main">
+              <a:graphicData uri="http://schemas.openxmlformats.org/drawingml/2006/picture">
+                <pic:pic xmlns:pic="http://schemas.openxmlformats.org/drawingml/2006/picture">
+                  <pic:nvPicPr>
+                    <pic:cNvPr id="249881189" name=""/>
+                    <pic:cNvPicPr/>
+                  </pic:nvPicPr>
+                  <pic:blipFill>
+                    <a:blip r:embed="rId9"/>
+                    <a:stretch>
+                      <a:fillRect/>
+                    </a:stretch>
+                  </pic:blipFill>
+                  <pic:spPr>
+                    <a:xfrm>
+                      <a:off x="0" y="0"/>
+                      <a:ext cx="3679915" cy="2085285"/>
+                    </a:xfrm>
+                    <a:prstGeom prst="rect">
+                      <a:avLst/>
+                    </a:prstGeom>
+                  </pic:spPr>
+                </pic:pic>
+              </a:graphicData>
+            </a:graphic>
+          </wp:inline>
+        </w:drawing>
+      </w:r>
+    </w:p>
+    <w:p>
+      <w:pPr>
+        <w:rPr>
+          <w:sz w:val="24"/>
+          <w:szCs w:val="24"/>
+        </w:rPr>
+      </w:pPr>
+      <w:r>
+        <w:rPr>
+          <w:sz w:val="24"/>
+          <w:szCs w:val="24"/>
+        </w:rPr>
+        <w:drawing>
+          <wp:inline distT="0" distB="0" distL="0" distR="0" wp14:anchorId="38D6088C" wp14:editId="5051FC8F">
+            <wp:extent cx="4078808" cy="3441700"/>
+            <wp:effectExtent l="0" t="0" r="0" b="6350"/>
+            <wp:docPr id="1973334383" name="Picture 1"/>
+            <wp:cNvGraphicFramePr>
+              <a:graphicFrameLocks xmlns:a="http://schemas.openxmlformats.org/drawingml/2006/main" noChangeAspect="1"/>
+            </wp:cNvGraphicFramePr>
+            <a:graphic xmlns:a="http://schemas.openxmlformats.org/drawingml/2006/main">
+              <a:graphicData uri="http://schemas.openxmlformats.org/drawingml/2006/picture">
+                <pic:pic xmlns:pic="http://schemas.openxmlformats.org/drawingml/2006/picture">
+                  <pic:nvPicPr>
+                    <pic:cNvPr id="1973334383" name=""/>
+                    <pic:cNvPicPr/>
+                  </pic:nvPicPr>
+                  <pic:blipFill>
+                    <a:blip r:embed="rId10"/>
+                    <a:stretch>
+                      <a:fillRect/>
+                    </a:stretch>
+                  </pic:blipFill>
+                  <pic:spPr>
+                    <a:xfrm>
+                      <a:off x="0" y="0"/>
+                      <a:ext cx="4083845" cy="3445950"/>
+                    </a:xfrm>
+                    <a:prstGeom prst="rect">
+                      <a:avLst/>
+                    </a:prstGeom>
+                  </pic:spPr>
+                </pic:pic>
+              </a:graphicData>
+            </a:graphic>
+          </wp:inline>
+        </w:drawing>
+      </w:r>
+    </w:p>
+    <w:p>
+      <w:pPr>
+        <w:rPr>
+          <w:sz w:val="24"/>
+          <w:szCs w:val="24"/>
+        </w:rPr>
+      </w:pPr>
+      <w:r>
+        <w:rPr>
+          <w:sz w:val="24"/>
+          <w:szCs w:val="24"/>
+        </w:rPr>
+        <w:lastRenderedPageBreak/>
+        <w:t>·Take a screenshot of the ResetBoard, IsOnBoard, MarkLegalMoves, and MarkValidKnightMoves methods in BoardLogic.</w:t>
+      </w:r>
+    </w:p>
+    <w:p>
+      <w:pPr>
+        <w:rPr>
+          <w:sz w:val="24"/>
+          <w:szCs w:val="24"/>
+        </w:rPr>
+      </w:pPr>
+      <w:r>
+        <w:rPr>
+          <w:sz w:val="24"/>
+          <w:szCs w:val="24"/>
+        </w:rPr>
+        <w:drawing>
+          <wp:inline distT="0" distB="0" distL="0" distR="0" wp14:anchorId="3BAD0BE2" wp14:editId="78ADAAF3">
+            <wp:extent cx="3162741" cy="3086531"/>
+            <wp:effectExtent l="0" t="0" r="0" b="0"/>
+            <wp:docPr id="1423826696" name="Picture 1"/>
+            <wp:cNvGraphicFramePr>
+              <a:graphicFrameLocks xmlns:a="http://schemas.openxmlformats.org/drawingml/2006/main" noChangeAspect="1"/>
+            </wp:cNvGraphicFramePr>
+            <a:graphic xmlns:a="http://schemas.openxmlformats.org/drawingml/2006/main">
+              <a:graphicData uri="http://schemas.openxmlformats.org/drawingml/2006/picture">
+                <pic:pic xmlns:pic="http://schemas.openxmlformats.org/drawingml/2006/picture">
+                  <pic:nvPicPr>
+                    <pic:cNvPr id="1423826696" name=""/>
+                    <pic:cNvPicPr/>
+                  </pic:nvPicPr>
+                  <pic:blipFill>
+                    <a:blip r:embed="rId11"/>
+                    <a:stretch>
+                      <a:fillRect/>
+                    </a:stretch>
+                  </pic:blipFill>
+                  <pic:spPr>
+                    <a:xfrm>
+                      <a:off x="0" y="0"/>
+                      <a:ext cx="3162741" cy="3086531"/>
+                    </a:xfrm>
+                    <a:prstGeom prst="rect">
+                      <a:avLst/>
+                    </a:prstGeom>
+                  </pic:spPr>
+                </pic:pic>
+              </a:graphicData>
+            </a:graphic>
+          </wp:inline>
+        </w:drawing>
+      </w:r>
+    </w:p>
+    <w:p>
+      <w:pPr>
+        <w:rPr>
+          <w:sz w:val="24"/>
+          <w:szCs w:val="24"/>
+        </w:rPr>
+      </w:pPr>
+    </w:p>
+    <w:p>
+      <w:pPr>
+        <w:rPr>
+          <w:sz w:val="24"/>
+          <w:szCs w:val="24"/>
+        </w:rPr>
+      </w:pPr>
+      <w:r>
+        <w:rPr>
+          <w:sz w:val="24"/>
+          <w:szCs w:val="24"/>
+        </w:rPr>
+        <w:drawing>
+          <wp:inline distT="0" distB="0" distL="0" distR="0" wp14:anchorId="3A0641EA" wp14:editId="1D1B7DBC">
+            <wp:extent cx="4972744" cy="4001058"/>
+            <wp:effectExtent l="0" t="0" r="0" b="0"/>
+            <wp:docPr id="460289168" name="Picture 1"/>
+            <wp:cNvGraphicFramePr>
+              <a:graphicFrameLocks xmlns:a="http://schemas.openxmlformats.org/drawingml/2006/main" noChangeAspect="1"/>
+            </wp:cNvGraphicFramePr>
+            <a:graphic xmlns:a="http://schemas.openxmlformats.org/drawingml/2006/main">
+              <a:graphicData uri="http://schemas.openxmlformats.org/drawingml/2006/picture">
+                <pic:pic xmlns:pic="http://schemas.openxmlformats.org/drawingml/2006/picture">
+                  <pic:nvPicPr>
+                    <pic:cNvPr id="460289168" name=""/>
+                    <pic:cNvPicPr/>
+                  </pic:nvPicPr>
+                  <pic:blipFill>
+                    <a:blip r:embed="rId12"/>
+                    <a:stretch>
+                      <a:fillRect/>
+                    </a:stretch>
+                  </pic:blipFill>
+                  <pic:spPr>
+                    <a:xfrm>
+                      <a:off x="0" y="0"/>
+                      <a:ext cx="4972744" cy="4001058"/>
+                    </a:xfrm>
+                    <a:prstGeom prst="rect">
+                      <a:avLst/>
+                    </a:prstGeom>
+                  </pic:spPr>
+                </pic:pic>
+              </a:graphicData>
+            </a:graphic>
+          </wp:inline>
+        </w:drawing>
+      </w:r>
+    </w:p>
+    <w:p>
+      <w:pPr>
+        <w:rPr>
+          <w:sz w:val="24"/>
+          <w:szCs w:val="24"/>
+        </w:rPr>
+      </w:pPr>
+      <w:r>
+        <w:rPr>
+          <w:sz w:val="24"/>
+          <w:szCs w:val="24"/>
+        </w:rPr>
+        <w:lastRenderedPageBreak/>
+        <w:drawing>
+          <wp:inline distT="0" distB="0" distL="0" distR="0" wp14:anchorId="69F185A8" wp14:editId="71A171B8">
+            <wp:extent cx="4353533" cy="3658111"/>
+            <wp:effectExtent l="0" t="0" r="9525" b="0"/>
+            <wp:docPr id="597663238" name="Picture 1"/>
+            <wp:cNvGraphicFramePr>
+              <a:graphicFrameLocks xmlns:a="http://schemas.openxmlformats.org/drawingml/2006/main" noChangeAspect="1"/>
+            </wp:cNvGraphicFramePr>
+            <a:graphic xmlns:a="http://schemas.openxmlformats.org/drawingml/2006/main">
+              <a:graphicData uri="http://schemas.openxmlformats.org/drawingml/2006/picture">
+                <pic:pic xmlns:pic="http://schemas.openxmlformats.org/drawingml/2006/picture">
+                  <pic:nvPicPr>
+                    <pic:cNvPr id="597663238" name=""/>
+                    <pic:cNvPicPr/>
+                  </pic:nvPicPr>
+                  <pic:blipFill>
+                    <a:blip r:embed="rId13"/>
+                    <a:stretch>
+                      <a:fillRect/>
+                    </a:stretch>
+                  </pic:blipFill>
+                  <pic:spPr>
+                    <a:xfrm>
+                      <a:off x="0" y="0"/>
+                      <a:ext cx="4353533" cy="3658111"/>
+                    </a:xfrm>
+                    <a:prstGeom prst="rect">
+                      <a:avLst/>
+                    </a:prstGeom>
+                  </pic:spPr>
+                </pic:pic>
+              </a:graphicData>
+            </a:graphic>
+          </wp:inline>
+        </w:drawing>
+      </w:r>
+    </w:p>
+    <w:p>
+      <w:pPr>
+        <w:rPr>
+          <w:sz w:val="24"/>
+          <w:szCs w:val="24"/>
+        </w:rPr>
+      </w:pPr>
+      <w:r>
+        <w:rPr>
+          <w:sz w:val="24"/>
+          <w:szCs w:val="24"/>
+        </w:rPr>
+        <w:t>·Take a screenshot of the UML for the CellModel, BoardModel, and BoardLogic classes.</w:t>
       </w:r>
     </w:p>
     <w:p>
@@ -2946,7 +3477,6 @@
   <w:style w:type="character" w:default="1" w:styleId="DefaultParagraphFont">
     <w:name w:val="Default Paragraph Font"/>
     <w:uiPriority w:val="1"/>
-    <w:semiHidden/>
     <w:unhideWhenUsed/>
   </w:style>
   <w:style w:type="table" w:default="1" w:styleId="TableNormal">

</xml_diff>

<commit_message>
Complete Bishop, Queen, and King movement logic & ·Commit Message: Add a console app to the class library.
</commit_message>
<xml_diff>
--- a/Activity 2.docx
+++ b/Activity 2.docx
@@ -1030,7 +1030,7 @@
           <w:sz w:val="24"/>
           <w:szCs w:val="24"/>
         </w:rPr>
-        <w:t>·Take a screenshot of the UML for the CellModel, BoardModel, and BoardLogic classes.</w:t>
+        <w:t>Take a screenshot of the UML for the CellModel, BoardModel, and BoardLogic classes.</w:t>
       </w:r>
     </w:p>
     <w:p>
@@ -1043,6 +1043,343 @@
           <w:szCs w:val="24"/>
         </w:rPr>
       </w:pPr>
+      <w:r>
+        <w:rPr>
+          <w:rFonts w:ascii="Times New Roman" w:eastAsia="Calibri" w:hAnsi="Times New Roman" w:cs="Times New Roman"/>
+          <w:bCs/>
+          <w:sz w:val="24"/>
+          <w:szCs w:val="24"/>
+        </w:rPr>
+        <w:br/>
+        <w:t>Adding the following features:</w:t>
+      </w:r>
+    </w:p>
+    <w:p>
+      <w:pPr>
+        <w:pStyle w:val="PlainText"/>
+        <w:rPr>
+          <w:rFonts w:ascii="Times New Roman" w:eastAsia="Calibri" w:hAnsi="Times New Roman" w:cs="Times New Roman"/>
+          <w:bCs/>
+          <w:sz w:val="24"/>
+          <w:szCs w:val="24"/>
+        </w:rPr>
+      </w:pPr>
+    </w:p>
+    <w:p>
+      <w:pPr>
+        <w:pStyle w:val="PlainText"/>
+        <w:numPr>
+          <w:ilvl w:val="0"/>
+          <w:numId w:val="20"/>
+        </w:numPr>
+        <w:rPr>
+          <w:rFonts w:ascii="Times New Roman" w:eastAsia="Calibri" w:hAnsi="Times New Roman" w:cs="Times New Roman"/>
+          <w:bCs/>
+          <w:sz w:val="24"/>
+          <w:szCs w:val="24"/>
+        </w:rPr>
+      </w:pPr>
+      <w:r>
+        <w:rPr>
+          <w:rFonts w:ascii="Times New Roman" w:eastAsia="Calibri" w:hAnsi="Times New Roman" w:cs="Times New Roman"/>
+          <w:bCs/>
+          <w:sz w:val="24"/>
+          <w:szCs w:val="24"/>
+        </w:rPr>
+        <w:t>Finish the rook case for in switch statement in its own method</w:t>
+      </w:r>
+    </w:p>
+    <w:p>
+      <w:pPr>
+        <w:pStyle w:val="PlainText"/>
+        <w:numPr>
+          <w:ilvl w:val="0"/>
+          <w:numId w:val="20"/>
+        </w:numPr>
+        <w:rPr>
+          <w:rFonts w:ascii="Times New Roman" w:eastAsia="Calibri" w:hAnsi="Times New Roman" w:cs="Times New Roman"/>
+          <w:bCs/>
+          <w:sz w:val="24"/>
+          <w:szCs w:val="24"/>
+        </w:rPr>
+      </w:pPr>
+      <w:r>
+        <w:rPr>
+          <w:rFonts w:ascii="Times New Roman" w:eastAsia="Calibri" w:hAnsi="Times New Roman" w:cs="Times New Roman"/>
+          <w:bCs/>
+          <w:sz w:val="24"/>
+          <w:szCs w:val="24"/>
+        </w:rPr>
+        <w:t>Finish the bishop case for in switch statement in its own method.</w:t>
+      </w:r>
+    </w:p>
+    <w:p>
+      <w:pPr>
+        <w:pStyle w:val="PlainText"/>
+        <w:numPr>
+          <w:ilvl w:val="0"/>
+          <w:numId w:val="20"/>
+        </w:numPr>
+        <w:rPr>
+          <w:rFonts w:ascii="Times New Roman" w:eastAsia="Calibri" w:hAnsi="Times New Roman" w:cs="Times New Roman"/>
+          <w:bCs/>
+          <w:sz w:val="24"/>
+          <w:szCs w:val="24"/>
+        </w:rPr>
+      </w:pPr>
+      <w:r>
+        <w:rPr>
+          <w:rFonts w:ascii="Times New Roman" w:eastAsia="Calibri" w:hAnsi="Times New Roman" w:cs="Times New Roman"/>
+          <w:bCs/>
+          <w:sz w:val="24"/>
+          <w:szCs w:val="24"/>
+        </w:rPr>
+        <w:t>Finish the queen case for in switch statement in its own method</w:t>
+      </w:r>
+    </w:p>
+    <w:p>
+      <w:pPr>
+        <w:pStyle w:val="PlainText"/>
+        <w:numPr>
+          <w:ilvl w:val="0"/>
+          <w:numId w:val="20"/>
+        </w:numPr>
+        <w:rPr>
+          <w:rFonts w:ascii="Times New Roman" w:eastAsia="Calibri" w:hAnsi="Times New Roman" w:cs="Times New Roman"/>
+          <w:bCs/>
+          <w:sz w:val="24"/>
+          <w:szCs w:val="24"/>
+        </w:rPr>
+      </w:pPr>
+      <w:r>
+        <w:rPr>
+          <w:rFonts w:ascii="Times New Roman" w:eastAsia="Calibri" w:hAnsi="Times New Roman" w:cs="Times New Roman"/>
+          <w:bCs/>
+          <w:sz w:val="24"/>
+          <w:szCs w:val="24"/>
+        </w:rPr>
+        <w:t>Finish the king case for in switch statement in its own method. The king can move one square in any direction on the board as shown in Figure 26.</w:t>
+      </w:r>
+    </w:p>
+    <w:p>
+      <w:pPr>
+        <w:pStyle w:val="PlainText"/>
+        <w:rPr>
+          <w:rFonts w:ascii="Times New Roman" w:eastAsia="Calibri" w:hAnsi="Times New Roman" w:cs="Times New Roman"/>
+          <w:bCs/>
+          <w:sz w:val="24"/>
+          <w:szCs w:val="24"/>
+        </w:rPr>
+      </w:pPr>
+    </w:p>
+    <w:p>
+      <w:pPr>
+        <w:pStyle w:val="PlainText"/>
+        <w:ind w:left="720"/>
+        <w:rPr>
+          <w:rFonts w:ascii="Times New Roman" w:eastAsia="Calibri" w:hAnsi="Times New Roman" w:cs="Times New Roman"/>
+          <w:bCs/>
+          <w:sz w:val="24"/>
+          <w:szCs w:val="24"/>
+        </w:rPr>
+      </w:pPr>
+    </w:p>
+    <w:p>
+      <w:pPr>
+        <w:pStyle w:val="PlainText"/>
+        <w:rPr>
+          <w:rFonts w:ascii="Times New Roman" w:eastAsia="Calibri" w:hAnsi="Times New Roman" w:cs="Times New Roman"/>
+          <w:bCs/>
+          <w:sz w:val="24"/>
+          <w:szCs w:val="24"/>
+        </w:rPr>
+      </w:pPr>
+    </w:p>
+    <w:p>
+      <w:pPr>
+        <w:pStyle w:val="PlainText"/>
+        <w:rPr>
+          <w:rFonts w:ascii="Times New Roman" w:eastAsia="Calibri" w:hAnsi="Times New Roman" w:cs="Times New Roman"/>
+          <w:bCs/>
+          <w:sz w:val="24"/>
+          <w:szCs w:val="24"/>
+        </w:rPr>
+      </w:pPr>
+      <w:r>
+        <w:rPr>
+          <w:rFonts w:ascii="Times New Roman" w:eastAsia="Calibri" w:hAnsi="Times New Roman" w:cs="Times New Roman"/>
+          <w:bCs/>
+          <w:sz w:val="24"/>
+          <w:szCs w:val="24"/>
+        </w:rPr>
+        <w:lastRenderedPageBreak/>
+        <w:drawing>
+          <wp:inline distT="0" distB="0" distL="0" distR="0" wp14:anchorId="0C946C43" wp14:editId="350A00B6">
+            <wp:extent cx="4677428" cy="3772426"/>
+            <wp:effectExtent l="0" t="0" r="8890" b="0"/>
+            <wp:docPr id="1190416310" name="Picture 1"/>
+            <wp:cNvGraphicFramePr>
+              <a:graphicFrameLocks xmlns:a="http://schemas.openxmlformats.org/drawingml/2006/main" noChangeAspect="1"/>
+            </wp:cNvGraphicFramePr>
+            <a:graphic xmlns:a="http://schemas.openxmlformats.org/drawingml/2006/main">
+              <a:graphicData uri="http://schemas.openxmlformats.org/drawingml/2006/picture">
+                <pic:pic xmlns:pic="http://schemas.openxmlformats.org/drawingml/2006/picture">
+                  <pic:nvPicPr>
+                    <pic:cNvPr id="1190416310" name=""/>
+                    <pic:cNvPicPr/>
+                  </pic:nvPicPr>
+                  <pic:blipFill>
+                    <a:blip r:embed="rId14"/>
+                    <a:stretch>
+                      <a:fillRect/>
+                    </a:stretch>
+                  </pic:blipFill>
+                  <pic:spPr>
+                    <a:xfrm>
+                      <a:off x="0" y="0"/>
+                      <a:ext cx="4677428" cy="3772426"/>
+                    </a:xfrm>
+                    <a:prstGeom prst="rect">
+                      <a:avLst/>
+                    </a:prstGeom>
+                  </pic:spPr>
+                </pic:pic>
+              </a:graphicData>
+            </a:graphic>
+          </wp:inline>
+        </w:drawing>
+      </w:r>
+    </w:p>
+    <w:p>
+      <w:pPr>
+        <w:pStyle w:val="PlainText"/>
+        <w:rPr>
+          <w:rFonts w:ascii="Times New Roman" w:eastAsia="Calibri" w:hAnsi="Times New Roman" w:cs="Times New Roman"/>
+          <w:bCs/>
+          <w:sz w:val="24"/>
+          <w:szCs w:val="24"/>
+        </w:rPr>
+      </w:pPr>
+    </w:p>
+    <w:p>
+      <w:pPr>
+        <w:pStyle w:val="PlainText"/>
+        <w:rPr>
+          <w:rFonts w:ascii="Times New Roman" w:eastAsia="Calibri" w:hAnsi="Times New Roman" w:cs="Times New Roman"/>
+          <w:bCs/>
+          <w:sz w:val="24"/>
+          <w:szCs w:val="24"/>
+        </w:rPr>
+      </w:pPr>
+      <w:r>
+        <w:rPr>
+          <w:rFonts w:ascii="Times New Roman" w:eastAsia="Calibri" w:hAnsi="Times New Roman" w:cs="Times New Roman"/>
+          <w:bCs/>
+          <w:sz w:val="24"/>
+          <w:szCs w:val="24"/>
+        </w:rPr>
+        <w:lastRenderedPageBreak/>
+        <w:drawing>
+          <wp:inline distT="0" distB="0" distL="0" distR="0" wp14:anchorId="6768211F" wp14:editId="20CB9AC0">
+            <wp:extent cx="4496427" cy="4505954"/>
+            <wp:effectExtent l="0" t="0" r="0" b="9525"/>
+            <wp:docPr id="1120983369" name="Picture 1"/>
+            <wp:cNvGraphicFramePr>
+              <a:graphicFrameLocks xmlns:a="http://schemas.openxmlformats.org/drawingml/2006/main" noChangeAspect="1"/>
+            </wp:cNvGraphicFramePr>
+            <a:graphic xmlns:a="http://schemas.openxmlformats.org/drawingml/2006/main">
+              <a:graphicData uri="http://schemas.openxmlformats.org/drawingml/2006/picture">
+                <pic:pic xmlns:pic="http://schemas.openxmlformats.org/drawingml/2006/picture">
+                  <pic:nvPicPr>
+                    <pic:cNvPr id="1120983369" name=""/>
+                    <pic:cNvPicPr/>
+                  </pic:nvPicPr>
+                  <pic:blipFill>
+                    <a:blip r:embed="rId15"/>
+                    <a:stretch>
+                      <a:fillRect/>
+                    </a:stretch>
+                  </pic:blipFill>
+                  <pic:spPr>
+                    <a:xfrm>
+                      <a:off x="0" y="0"/>
+                      <a:ext cx="4496427" cy="4505954"/>
+                    </a:xfrm>
+                    <a:prstGeom prst="rect">
+                      <a:avLst/>
+                    </a:prstGeom>
+                  </pic:spPr>
+                </pic:pic>
+              </a:graphicData>
+            </a:graphic>
+          </wp:inline>
+        </w:drawing>
+      </w:r>
+    </w:p>
+    <w:p>
+      <w:pPr>
+        <w:pStyle w:val="PlainText"/>
+        <w:rPr>
+          <w:rFonts w:ascii="Times New Roman" w:eastAsia="Calibri" w:hAnsi="Times New Roman" w:cs="Times New Roman"/>
+          <w:bCs/>
+          <w:sz w:val="24"/>
+          <w:szCs w:val="24"/>
+        </w:rPr>
+      </w:pPr>
+    </w:p>
+    <w:p>
+      <w:pPr>
+        <w:pStyle w:val="PlainText"/>
+        <w:rPr>
+          <w:rFonts w:ascii="Times New Roman" w:eastAsia="Calibri" w:hAnsi="Times New Roman" w:cs="Times New Roman"/>
+          <w:bCs/>
+          <w:sz w:val="24"/>
+          <w:szCs w:val="24"/>
+        </w:rPr>
+      </w:pPr>
+      <w:r>
+        <w:rPr>
+          <w:rFonts w:ascii="Times New Roman" w:eastAsia="Calibri" w:hAnsi="Times New Roman" w:cs="Times New Roman"/>
+          <w:bCs/>
+          <w:sz w:val="24"/>
+          <w:szCs w:val="24"/>
+        </w:rPr>
+        <w:drawing>
+          <wp:inline distT="0" distB="0" distL="0" distR="0" wp14:anchorId="7AAC77EF" wp14:editId="45820E80">
+            <wp:extent cx="4239217" cy="2848373"/>
+            <wp:effectExtent l="0" t="0" r="9525" b="9525"/>
+            <wp:docPr id="117545286" name="Picture 1"/>
+            <wp:cNvGraphicFramePr>
+              <a:graphicFrameLocks xmlns:a="http://schemas.openxmlformats.org/drawingml/2006/main" noChangeAspect="1"/>
+            </wp:cNvGraphicFramePr>
+            <a:graphic xmlns:a="http://schemas.openxmlformats.org/drawingml/2006/main">
+              <a:graphicData uri="http://schemas.openxmlformats.org/drawingml/2006/picture">
+                <pic:pic xmlns:pic="http://schemas.openxmlformats.org/drawingml/2006/picture">
+                  <pic:nvPicPr>
+                    <pic:cNvPr id="117545286" name=""/>
+                    <pic:cNvPicPr/>
+                  </pic:nvPicPr>
+                  <pic:blipFill>
+                    <a:blip r:embed="rId16"/>
+                    <a:stretch>
+                      <a:fillRect/>
+                    </a:stretch>
+                  </pic:blipFill>
+                  <pic:spPr>
+                    <a:xfrm>
+                      <a:off x="0" y="0"/>
+                      <a:ext cx="4239217" cy="2848373"/>
+                    </a:xfrm>
+                    <a:prstGeom prst="rect">
+                      <a:avLst/>
+                    </a:prstGeom>
+                  </pic:spPr>
+                </pic:pic>
+              </a:graphicData>
+            </a:graphic>
+          </wp:inline>
+        </w:drawing>
+      </w:r>
     </w:p>
     <w:sectPr>
       <w:pgSz w:w="12240" w:h="15840"/>
@@ -1578,6 +1915,95 @@
     </w:lvl>
   </w:abstractNum>
   <w:abstractNum w:abstractNumId="5" w15:restartNumberingAfterBreak="0">
+    <w:nsid w:val="20021AAE"/>
+    <w:multiLevelType w:val="hybridMultilevel"/>
+    <w:tmpl w:val="7A905FBE"/>
+    <w:lvl w:ilvl="0" w:tplc="0409000F">
+      <w:start w:val="1"/>
+      <w:numFmt w:val="decimal"/>
+      <w:lvlText w:val="%1."/>
+      <w:lvlJc w:val="left"/>
+      <w:pPr>
+        <w:ind w:left="720" w:hanging="360"/>
+      </w:pPr>
+      <w:rPr>
+        <w:rFonts w:hint="default"/>
+      </w:rPr>
+    </w:lvl>
+    <w:lvl w:ilvl="1" w:tplc="04090019" w:tentative="1">
+      <w:start w:val="1"/>
+      <w:numFmt w:val="lowerLetter"/>
+      <w:lvlText w:val="%2."/>
+      <w:lvlJc w:val="left"/>
+      <w:pPr>
+        <w:ind w:left="1440" w:hanging="360"/>
+      </w:pPr>
+    </w:lvl>
+    <w:lvl w:ilvl="2" w:tplc="0409001B" w:tentative="1">
+      <w:start w:val="1"/>
+      <w:numFmt w:val="lowerRoman"/>
+      <w:lvlText w:val="%3."/>
+      <w:lvlJc w:val="right"/>
+      <w:pPr>
+        <w:ind w:left="2160" w:hanging="180"/>
+      </w:pPr>
+    </w:lvl>
+    <w:lvl w:ilvl="3" w:tplc="0409000F" w:tentative="1">
+      <w:start w:val="1"/>
+      <w:numFmt w:val="decimal"/>
+      <w:lvlText w:val="%4."/>
+      <w:lvlJc w:val="left"/>
+      <w:pPr>
+        <w:ind w:left="2880" w:hanging="360"/>
+      </w:pPr>
+    </w:lvl>
+    <w:lvl w:ilvl="4" w:tplc="04090019" w:tentative="1">
+      <w:start w:val="1"/>
+      <w:numFmt w:val="lowerLetter"/>
+      <w:lvlText w:val="%5."/>
+      <w:lvlJc w:val="left"/>
+      <w:pPr>
+        <w:ind w:left="3600" w:hanging="360"/>
+      </w:pPr>
+    </w:lvl>
+    <w:lvl w:ilvl="5" w:tplc="0409001B" w:tentative="1">
+      <w:start w:val="1"/>
+      <w:numFmt w:val="lowerRoman"/>
+      <w:lvlText w:val="%6."/>
+      <w:lvlJc w:val="right"/>
+      <w:pPr>
+        <w:ind w:left="4320" w:hanging="180"/>
+      </w:pPr>
+    </w:lvl>
+    <w:lvl w:ilvl="6" w:tplc="0409000F" w:tentative="1">
+      <w:start w:val="1"/>
+      <w:numFmt w:val="decimal"/>
+      <w:lvlText w:val="%7."/>
+      <w:lvlJc w:val="left"/>
+      <w:pPr>
+        <w:ind w:left="5040" w:hanging="360"/>
+      </w:pPr>
+    </w:lvl>
+    <w:lvl w:ilvl="7" w:tplc="04090019" w:tentative="1">
+      <w:start w:val="1"/>
+      <w:numFmt w:val="lowerLetter"/>
+      <w:lvlText w:val="%8."/>
+      <w:lvlJc w:val="left"/>
+      <w:pPr>
+        <w:ind w:left="5760" w:hanging="360"/>
+      </w:pPr>
+    </w:lvl>
+    <w:lvl w:ilvl="8" w:tplc="0409001B" w:tentative="1">
+      <w:start w:val="1"/>
+      <w:numFmt w:val="lowerRoman"/>
+      <w:lvlText w:val="%9."/>
+      <w:lvlJc w:val="right"/>
+      <w:pPr>
+        <w:ind w:left="6480" w:hanging="180"/>
+      </w:pPr>
+    </w:lvl>
+  </w:abstractNum>
+  <w:abstractNum w:abstractNumId="6" w15:restartNumberingAfterBreak="0">
     <w:nsid w:val="328255A4"/>
     <w:multiLevelType w:val="hybridMultilevel"/>
     <w:tmpl w:val="EE34CF6C"/>
@@ -1666,7 +2092,7 @@
       </w:pPr>
     </w:lvl>
   </w:abstractNum>
-  <w:abstractNum w:abstractNumId="6" w15:restartNumberingAfterBreak="0">
+  <w:abstractNum w:abstractNumId="7" w15:restartNumberingAfterBreak="0">
     <w:nsid w:val="376A11F4"/>
     <w:multiLevelType w:val="multilevel"/>
     <w:tmpl w:val="07908D4E"/>
@@ -1779,7 +2205,7 @@
       </w:pPr>
     </w:lvl>
   </w:abstractNum>
-  <w:abstractNum w:abstractNumId="7" w15:restartNumberingAfterBreak="0">
+  <w:abstractNum w:abstractNumId="8" w15:restartNumberingAfterBreak="0">
     <w:nsid w:val="37F44FF2"/>
     <w:multiLevelType w:val="hybridMultilevel"/>
     <w:tmpl w:val="EE34CF6C"/>
@@ -1868,7 +2294,7 @@
       </w:pPr>
     </w:lvl>
   </w:abstractNum>
-  <w:abstractNum w:abstractNumId="8" w15:restartNumberingAfterBreak="0">
+  <w:abstractNum w:abstractNumId="9" w15:restartNumberingAfterBreak="0">
     <w:nsid w:val="38CD459E"/>
     <w:multiLevelType w:val="hybridMultilevel"/>
     <w:tmpl w:val="34F06442"/>
@@ -1954,7 +2380,7 @@
       </w:pPr>
     </w:lvl>
   </w:abstractNum>
-  <w:abstractNum w:abstractNumId="9" w15:restartNumberingAfterBreak="0">
+  <w:abstractNum w:abstractNumId="10" w15:restartNumberingAfterBreak="0">
     <w:nsid w:val="44CF0D97"/>
     <w:multiLevelType w:val="hybridMultilevel"/>
     <w:tmpl w:val="68E6B6B2"/>
@@ -2043,7 +2469,7 @@
       </w:pPr>
     </w:lvl>
   </w:abstractNum>
-  <w:abstractNum w:abstractNumId="10" w15:restartNumberingAfterBreak="0">
+  <w:abstractNum w:abstractNumId="11" w15:restartNumberingAfterBreak="0">
     <w:nsid w:val="4B61070A"/>
     <w:multiLevelType w:val="hybridMultilevel"/>
     <w:tmpl w:val="78E45E54"/>
@@ -2132,7 +2558,7 @@
       </w:pPr>
     </w:lvl>
   </w:abstractNum>
-  <w:abstractNum w:abstractNumId="11" w15:restartNumberingAfterBreak="0">
+  <w:abstractNum w:abstractNumId="12" w15:restartNumberingAfterBreak="0">
     <w:nsid w:val="555557A4"/>
     <w:multiLevelType w:val="hybridMultilevel"/>
     <w:tmpl w:val="DB9EF5AA"/>
@@ -2218,7 +2644,7 @@
       </w:pPr>
     </w:lvl>
   </w:abstractNum>
-  <w:abstractNum w:abstractNumId="12" w15:restartNumberingAfterBreak="0">
+  <w:abstractNum w:abstractNumId="13" w15:restartNumberingAfterBreak="0">
     <w:nsid w:val="58BC7433"/>
     <w:multiLevelType w:val="hybridMultilevel"/>
     <w:tmpl w:val="0A721F58"/>
@@ -2304,7 +2730,7 @@
       </w:pPr>
     </w:lvl>
   </w:abstractNum>
-  <w:abstractNum w:abstractNumId="13" w15:restartNumberingAfterBreak="0">
+  <w:abstractNum w:abstractNumId="14" w15:restartNumberingAfterBreak="0">
     <w:nsid w:val="63323CCC"/>
     <w:multiLevelType w:val="hybridMultilevel"/>
     <w:tmpl w:val="7C70441C"/>
@@ -2393,7 +2819,7 @@
       </w:pPr>
     </w:lvl>
   </w:abstractNum>
-  <w:abstractNum w:abstractNumId="14" w15:restartNumberingAfterBreak="0">
+  <w:abstractNum w:abstractNumId="15" w15:restartNumberingAfterBreak="0">
     <w:nsid w:val="775C659F"/>
     <w:multiLevelType w:val="hybridMultilevel"/>
     <w:tmpl w:val="B09CF1FC"/>
@@ -2506,7 +2932,7 @@
       </w:rPr>
     </w:lvl>
   </w:abstractNum>
-  <w:abstractNum w:abstractNumId="15" w15:restartNumberingAfterBreak="0">
+  <w:abstractNum w:abstractNumId="16" w15:restartNumberingAfterBreak="0">
     <w:nsid w:val="79F44753"/>
     <w:multiLevelType w:val="hybridMultilevel"/>
     <w:tmpl w:val="379002D2"/>
@@ -2592,7 +3018,7 @@
       </w:pPr>
     </w:lvl>
   </w:abstractNum>
-  <w:abstractNum w:abstractNumId="16" w15:restartNumberingAfterBreak="0">
+  <w:abstractNum w:abstractNumId="17" w15:restartNumberingAfterBreak="0">
     <w:nsid w:val="7EF1444E"/>
     <w:multiLevelType w:val="hybridMultilevel"/>
     <w:tmpl w:val="379002D2"/>
@@ -2679,7 +3105,7 @@
     </w:lvl>
   </w:abstractNum>
   <w:num w:numId="1" w16cid:durableId="196891131">
-    <w:abstractNumId w:val="12"/>
+    <w:abstractNumId w:val="13"/>
     <w:lvlOverride w:ilvl="0">
       <w:startOverride w:val="1"/>
     </w:lvlOverride>
@@ -2712,7 +3138,7 @@
     <w:abstractNumId w:val="4"/>
   </w:num>
   <w:num w:numId="3" w16cid:durableId="2011641105">
-    <w:abstractNumId w:val="11"/>
+    <w:abstractNumId w:val="12"/>
     <w:lvlOverride w:ilvl="0">
       <w:startOverride w:val="1"/>
     </w:lvlOverride>
@@ -2742,7 +3168,7 @@
     </w:lvlOverride>
   </w:num>
   <w:num w:numId="4" w16cid:durableId="1023020546">
-    <w:abstractNumId w:val="16"/>
+    <w:abstractNumId w:val="17"/>
     <w:lvlOverride w:ilvl="0">
       <w:startOverride w:val="1"/>
     </w:lvlOverride>
@@ -2772,13 +3198,13 @@
     </w:lvlOverride>
   </w:num>
   <w:num w:numId="5" w16cid:durableId="1197162694">
-    <w:abstractNumId w:val="11"/>
+    <w:abstractNumId w:val="12"/>
   </w:num>
   <w:num w:numId="6" w16cid:durableId="281544093">
-    <w:abstractNumId w:val="15"/>
+    <w:abstractNumId w:val="16"/>
   </w:num>
   <w:num w:numId="7" w16cid:durableId="128480522">
-    <w:abstractNumId w:val="7"/>
+    <w:abstractNumId w:val="8"/>
     <w:lvlOverride w:ilvl="0">
       <w:startOverride w:val="1"/>
     </w:lvlOverride>
@@ -2808,16 +3234,16 @@
     </w:lvlOverride>
   </w:num>
   <w:num w:numId="8" w16cid:durableId="506941923">
-    <w:abstractNumId w:val="13"/>
+    <w:abstractNumId w:val="14"/>
   </w:num>
   <w:num w:numId="9" w16cid:durableId="181432289">
-    <w:abstractNumId w:val="7"/>
+    <w:abstractNumId w:val="8"/>
   </w:num>
   <w:num w:numId="10" w16cid:durableId="1041589641">
-    <w:abstractNumId w:val="5"/>
+    <w:abstractNumId w:val="6"/>
   </w:num>
   <w:num w:numId="11" w16cid:durableId="301929760">
-    <w:abstractNumId w:val="8"/>
+    <w:abstractNumId w:val="9"/>
     <w:lvlOverride w:ilvl="0">
       <w:startOverride w:val="1"/>
     </w:lvlOverride>
@@ -2847,10 +3273,10 @@
     </w:lvlOverride>
   </w:num>
   <w:num w:numId="12" w16cid:durableId="1084958439">
-    <w:abstractNumId w:val="6"/>
+    <w:abstractNumId w:val="7"/>
   </w:num>
   <w:num w:numId="13" w16cid:durableId="340662644">
-    <w:abstractNumId w:val="10"/>
+    <w:abstractNumId w:val="11"/>
   </w:num>
   <w:num w:numId="14" w16cid:durableId="1670987391">
     <w:abstractNumId w:val="3"/>
@@ -2865,10 +3291,13 @@
     <w:abstractNumId w:val="0"/>
   </w:num>
   <w:num w:numId="18" w16cid:durableId="113793928">
-    <w:abstractNumId w:val="9"/>
+    <w:abstractNumId w:val="10"/>
   </w:num>
   <w:num w:numId="19" w16cid:durableId="1107428376">
-    <w:abstractNumId w:val="14"/>
+    <w:abstractNumId w:val="15"/>
+  </w:num>
+  <w:num w:numId="20" w16cid:durableId="1942488692">
+    <w:abstractNumId w:val="5"/>
   </w:num>
 </w:numbering>
 </file>

</xml_diff>

<commit_message>
Add user input from chess pieces to the console app.
</commit_message>
<xml_diff>
--- a/Activity 2.docx
+++ b/Activity 2.docx
@@ -409,6 +409,7 @@
           <w:szCs w:val="24"/>
         </w:rPr>
       </w:pPr>
+      <w:proofErr w:type="spellStart"/>
       <w:r>
         <w:rPr>
           <w:b/>
@@ -416,7 +417,17 @@
           <w:sz w:val="24"/>
           <w:szCs w:val="24"/>
         </w:rPr>
-        <w:t>Github Link:</w:t>
+        <w:t>Github</w:t>
+      </w:r>
+      <w:proofErr w:type="spellEnd"/>
+      <w:r>
+        <w:rPr>
+          <w:b/>
+          <w:bCs/>
+          <w:sz w:val="24"/>
+          <w:szCs w:val="24"/>
+        </w:rPr>
+        <w:t xml:space="preserve"> Link:</w:t>
       </w:r>
       <w:r>
         <w:rPr>
@@ -513,7 +524,55 @@
           <w:sz w:val="24"/>
           <w:szCs w:val="24"/>
         </w:rPr>
-        <w:t>·Take a screenshot of the citations for CellModel, BoardModel, and BoardLogic. Make sure to include the class declarations in the images.</w:t>
+        <w:t xml:space="preserve">·Take a screenshot of the citations for </w:t>
+      </w:r>
+      <w:proofErr w:type="spellStart"/>
+      <w:r>
+        <w:rPr>
+          <w:sz w:val="24"/>
+          <w:szCs w:val="24"/>
+        </w:rPr>
+        <w:t>CellModel</w:t>
+      </w:r>
+      <w:proofErr w:type="spellEnd"/>
+      <w:r>
+        <w:rPr>
+          <w:sz w:val="24"/>
+          <w:szCs w:val="24"/>
+        </w:rPr>
+        <w:t xml:space="preserve">, </w:t>
+      </w:r>
+      <w:proofErr w:type="spellStart"/>
+      <w:r>
+        <w:rPr>
+          <w:sz w:val="24"/>
+          <w:szCs w:val="24"/>
+        </w:rPr>
+        <w:t>BoardModel</w:t>
+      </w:r>
+      <w:proofErr w:type="spellEnd"/>
+      <w:r>
+        <w:rPr>
+          <w:sz w:val="24"/>
+          <w:szCs w:val="24"/>
+        </w:rPr>
+        <w:t xml:space="preserve">, and </w:t>
+      </w:r>
+      <w:proofErr w:type="spellStart"/>
+      <w:r>
+        <w:rPr>
+          <w:sz w:val="24"/>
+          <w:szCs w:val="24"/>
+        </w:rPr>
+        <w:t>BoardLogic</w:t>
+      </w:r>
+      <w:proofErr w:type="spellEnd"/>
+      <w:r>
+        <w:rPr>
+          <w:sz w:val="24"/>
+          <w:szCs w:val="24"/>
+        </w:rPr>
+        <w:t>. Make sure to include the class declarations in the images.</w:t>
       </w:r>
     </w:p>
     <w:p>
@@ -745,7 +804,71 @@
           <w:sz w:val="24"/>
           <w:szCs w:val="24"/>
         </w:rPr>
-        <w:t>·Take a screenshot of the CellModel and BoardModel constructors and InitializeBoard method in the BoardModel class.</w:t>
+        <w:t xml:space="preserve">·Take a screenshot of the </w:t>
+      </w:r>
+      <w:proofErr w:type="spellStart"/>
+      <w:r>
+        <w:rPr>
+          <w:sz w:val="24"/>
+          <w:szCs w:val="24"/>
+        </w:rPr>
+        <w:t>CellModel</w:t>
+      </w:r>
+      <w:proofErr w:type="spellEnd"/>
+      <w:r>
+        <w:rPr>
+          <w:sz w:val="24"/>
+          <w:szCs w:val="24"/>
+        </w:rPr>
+        <w:t xml:space="preserve"> and </w:t>
+      </w:r>
+      <w:proofErr w:type="spellStart"/>
+      <w:r>
+        <w:rPr>
+          <w:sz w:val="24"/>
+          <w:szCs w:val="24"/>
+        </w:rPr>
+        <w:t>BoardModel</w:t>
+      </w:r>
+      <w:proofErr w:type="spellEnd"/>
+      <w:r>
+        <w:rPr>
+          <w:sz w:val="24"/>
+          <w:szCs w:val="24"/>
+        </w:rPr>
+        <w:t xml:space="preserve"> constructors and </w:t>
+      </w:r>
+      <w:proofErr w:type="spellStart"/>
+      <w:r>
+        <w:rPr>
+          <w:sz w:val="24"/>
+          <w:szCs w:val="24"/>
+        </w:rPr>
+        <w:t>InitializeBoard</w:t>
+      </w:r>
+      <w:proofErr w:type="spellEnd"/>
+      <w:r>
+        <w:rPr>
+          <w:sz w:val="24"/>
+          <w:szCs w:val="24"/>
+        </w:rPr>
+        <w:t xml:space="preserve"> method in the </w:t>
+      </w:r>
+      <w:proofErr w:type="spellStart"/>
+      <w:r>
+        <w:rPr>
+          <w:sz w:val="24"/>
+          <w:szCs w:val="24"/>
+        </w:rPr>
+        <w:t>BoardModel</w:t>
+      </w:r>
+      <w:proofErr w:type="spellEnd"/>
+      <w:r>
+        <w:rPr>
+          <w:sz w:val="24"/>
+          <w:szCs w:val="24"/>
+        </w:rPr>
+        <w:t xml:space="preserve"> class.</w:t>
       </w:r>
     </w:p>
     <w:p>
@@ -859,7 +982,87 @@
           <w:szCs w:val="24"/>
         </w:rPr>
         <w:lastRenderedPageBreak/>
-        <w:t>·Take a screenshot of the ResetBoard, IsOnBoard, MarkLegalMoves, and MarkValidKnightMoves methods in BoardLogic.</w:t>
+        <w:t xml:space="preserve">·Take a screenshot of the </w:t>
+      </w:r>
+      <w:proofErr w:type="spellStart"/>
+      <w:r>
+        <w:rPr>
+          <w:sz w:val="24"/>
+          <w:szCs w:val="24"/>
+        </w:rPr>
+        <w:t>ResetBoard</w:t>
+      </w:r>
+      <w:proofErr w:type="spellEnd"/>
+      <w:r>
+        <w:rPr>
+          <w:sz w:val="24"/>
+          <w:szCs w:val="24"/>
+        </w:rPr>
+        <w:t xml:space="preserve">, </w:t>
+      </w:r>
+      <w:proofErr w:type="spellStart"/>
+      <w:r>
+        <w:rPr>
+          <w:sz w:val="24"/>
+          <w:szCs w:val="24"/>
+        </w:rPr>
+        <w:t>IsOnBoard</w:t>
+      </w:r>
+      <w:proofErr w:type="spellEnd"/>
+      <w:r>
+        <w:rPr>
+          <w:sz w:val="24"/>
+          <w:szCs w:val="24"/>
+        </w:rPr>
+        <w:t xml:space="preserve">, </w:t>
+      </w:r>
+      <w:proofErr w:type="spellStart"/>
+      <w:r>
+        <w:rPr>
+          <w:sz w:val="24"/>
+          <w:szCs w:val="24"/>
+        </w:rPr>
+        <w:t>MarkLegalMoves</w:t>
+      </w:r>
+      <w:proofErr w:type="spellEnd"/>
+      <w:r>
+        <w:rPr>
+          <w:sz w:val="24"/>
+          <w:szCs w:val="24"/>
+        </w:rPr>
+        <w:t xml:space="preserve">, and </w:t>
+      </w:r>
+      <w:proofErr w:type="spellStart"/>
+      <w:r>
+        <w:rPr>
+          <w:sz w:val="24"/>
+          <w:szCs w:val="24"/>
+        </w:rPr>
+        <w:t>MarkValidKnightMoves</w:t>
+      </w:r>
+      <w:proofErr w:type="spellEnd"/>
+      <w:r>
+        <w:rPr>
+          <w:sz w:val="24"/>
+          <w:szCs w:val="24"/>
+        </w:rPr>
+        <w:t xml:space="preserve"> methods in </w:t>
+      </w:r>
+      <w:proofErr w:type="spellStart"/>
+      <w:r>
+        <w:rPr>
+          <w:sz w:val="24"/>
+          <w:szCs w:val="24"/>
+        </w:rPr>
+        <w:t>BoardLogic</w:t>
+      </w:r>
+      <w:proofErr w:type="spellEnd"/>
+      <w:r>
+        <w:rPr>
+          <w:sz w:val="24"/>
+          <w:szCs w:val="24"/>
+        </w:rPr>
+        <w:t>.</w:t>
       </w:r>
     </w:p>
     <w:p>
@@ -1030,7 +1233,55 @@
           <w:sz w:val="24"/>
           <w:szCs w:val="24"/>
         </w:rPr>
-        <w:t>Take a screenshot of the UML for the CellModel, BoardModel, and BoardLogic classes.</w:t>
+        <w:t xml:space="preserve">Take a screenshot of the UML for the </w:t>
+      </w:r>
+      <w:proofErr w:type="spellStart"/>
+      <w:r>
+        <w:rPr>
+          <w:sz w:val="24"/>
+          <w:szCs w:val="24"/>
+        </w:rPr>
+        <w:t>CellModel</w:t>
+      </w:r>
+      <w:proofErr w:type="spellEnd"/>
+      <w:r>
+        <w:rPr>
+          <w:sz w:val="24"/>
+          <w:szCs w:val="24"/>
+        </w:rPr>
+        <w:t xml:space="preserve">, </w:t>
+      </w:r>
+      <w:proofErr w:type="spellStart"/>
+      <w:r>
+        <w:rPr>
+          <w:sz w:val="24"/>
+          <w:szCs w:val="24"/>
+        </w:rPr>
+        <w:t>BoardModel</w:t>
+      </w:r>
+      <w:proofErr w:type="spellEnd"/>
+      <w:r>
+        <w:rPr>
+          <w:sz w:val="24"/>
+          <w:szCs w:val="24"/>
+        </w:rPr>
+        <w:t xml:space="preserve">, and </w:t>
+      </w:r>
+      <w:proofErr w:type="spellStart"/>
+      <w:r>
+        <w:rPr>
+          <w:sz w:val="24"/>
+          <w:szCs w:val="24"/>
+        </w:rPr>
+        <w:t>BoardLogic</w:t>
+      </w:r>
+      <w:proofErr w:type="spellEnd"/>
+      <w:r>
+        <w:rPr>
+          <w:sz w:val="24"/>
+          <w:szCs w:val="24"/>
+        </w:rPr>
+        <w:t xml:space="preserve"> classes.</w:t>
       </w:r>
     </w:p>
     <w:p>
@@ -1380,6 +1631,134 @@
           </wp:inline>
         </w:drawing>
       </w:r>
+    </w:p>
+    <w:p>
+      <w:pPr>
+        <w:pStyle w:val="PlainText"/>
+        <w:rPr>
+          <w:rFonts w:ascii="Times New Roman" w:eastAsia="Calibri" w:hAnsi="Times New Roman" w:cs="Times New Roman"/>
+          <w:bCs/>
+          <w:sz w:val="24"/>
+          <w:szCs w:val="24"/>
+        </w:rPr>
+      </w:pPr>
+    </w:p>
+    <w:p>
+      <w:pPr>
+        <w:pStyle w:val="PlainText"/>
+        <w:rPr>
+          <w:rFonts w:ascii="Times New Roman" w:eastAsia="Calibri" w:hAnsi="Times New Roman" w:cs="Times New Roman"/>
+          <w:bCs/>
+          <w:sz w:val="24"/>
+          <w:szCs w:val="24"/>
+        </w:rPr>
+      </w:pPr>
+      <w:r>
+        <w:rPr>
+          <w:rFonts w:ascii="Times New Roman" w:eastAsia="Calibri" w:hAnsi="Times New Roman" w:cs="Times New Roman"/>
+          <w:bCs/>
+          <w:sz w:val="24"/>
+          <w:szCs w:val="24"/>
+        </w:rPr>
+        <w:t>Part 2:</w:t>
+      </w:r>
+    </w:p>
+    <w:p>
+      <w:pPr>
+        <w:pStyle w:val="PlainText"/>
+        <w:rPr>
+          <w:rFonts w:ascii="Times New Roman" w:eastAsia="Calibri" w:hAnsi="Times New Roman" w:cs="Times New Roman"/>
+          <w:bCs/>
+          <w:sz w:val="24"/>
+          <w:szCs w:val="24"/>
+        </w:rPr>
+      </w:pPr>
+    </w:p>
+    <w:p>
+      <w:pPr>
+        <w:pStyle w:val="PlainText"/>
+        <w:rPr>
+          <w:rFonts w:ascii="Times New Roman" w:eastAsia="Calibri" w:hAnsi="Times New Roman" w:cs="Times New Roman"/>
+          <w:bCs/>
+          <w:sz w:val="24"/>
+          <w:szCs w:val="24"/>
+        </w:rPr>
+      </w:pPr>
+      <w:r>
+        <w:rPr>
+          <w:rFonts w:ascii="Times New Roman" w:eastAsia="Calibri" w:hAnsi="Times New Roman" w:cs="Times New Roman"/>
+          <w:bCs/>
+          <w:sz w:val="24"/>
+          <w:szCs w:val="24"/>
+        </w:rPr>
+        <w:lastRenderedPageBreak/>
+        <w:t>The application being run</w:t>
+      </w:r>
+    </w:p>
+    <w:p>
+      <w:pPr>
+        <w:pStyle w:val="PlainText"/>
+        <w:rPr>
+          <w:rFonts w:ascii="Times New Roman" w:eastAsia="Calibri" w:hAnsi="Times New Roman" w:cs="Times New Roman"/>
+          <w:bCs/>
+          <w:sz w:val="24"/>
+          <w:szCs w:val="24"/>
+        </w:rPr>
+      </w:pPr>
+      <w:r>
+        <w:rPr>
+          <w:rFonts w:ascii="Times New Roman" w:eastAsia="Calibri" w:hAnsi="Times New Roman" w:cs="Times New Roman"/>
+          <w:bCs/>
+          <w:sz w:val="24"/>
+          <w:szCs w:val="24"/>
+        </w:rPr>
+        <w:drawing>
+          <wp:inline distT="0" distB="0" distL="0" distR="0" wp14:anchorId="5BFC6135" wp14:editId="2DFE15B5">
+            <wp:extent cx="3575050" cy="2971569"/>
+            <wp:effectExtent l="0" t="0" r="6350" b="635"/>
+            <wp:docPr id="1924618855" name="Picture 1"/>
+            <wp:cNvGraphicFramePr>
+              <a:graphicFrameLocks xmlns:a="http://schemas.openxmlformats.org/drawingml/2006/main" noChangeAspect="1"/>
+            </wp:cNvGraphicFramePr>
+            <a:graphic xmlns:a="http://schemas.openxmlformats.org/drawingml/2006/main">
+              <a:graphicData uri="http://schemas.openxmlformats.org/drawingml/2006/picture">
+                <pic:pic xmlns:pic="http://schemas.openxmlformats.org/drawingml/2006/picture">
+                  <pic:nvPicPr>
+                    <pic:cNvPr id="1924618855" name=""/>
+                    <pic:cNvPicPr/>
+                  </pic:nvPicPr>
+                  <pic:blipFill>
+                    <a:blip r:embed="rId17"/>
+                    <a:stretch>
+                      <a:fillRect/>
+                    </a:stretch>
+                  </pic:blipFill>
+                  <pic:spPr>
+                    <a:xfrm>
+                      <a:off x="0" y="0"/>
+                      <a:ext cx="3581847" cy="2977219"/>
+                    </a:xfrm>
+                    <a:prstGeom prst="rect">
+                      <a:avLst/>
+                    </a:prstGeom>
+                  </pic:spPr>
+                </pic:pic>
+              </a:graphicData>
+            </a:graphic>
+          </wp:inline>
+        </w:drawing>
+      </w:r>
+    </w:p>
+    <w:p>
+      <w:pPr>
+        <w:pStyle w:val="PlainText"/>
+        <w:rPr>
+          <w:rFonts w:ascii="Times New Roman" w:eastAsia="Calibri" w:hAnsi="Times New Roman" w:cs="Times New Roman"/>
+          <w:bCs/>
+          <w:sz w:val="24"/>
+          <w:szCs w:val="24"/>
+        </w:rPr>
+      </w:pPr>
     </w:p>
     <w:sectPr>
       <w:pgSz w:w="12240" w:h="15840"/>

</xml_diff>

<commit_message>
Complete console challenges with input validation and board formatting
</commit_message>
<xml_diff>
--- a/Activity 2.docx
+++ b/Activity 2.docx
@@ -1747,6 +1747,521 @@
             </a:graphic>
           </wp:inline>
         </w:drawing>
+      </w:r>
+    </w:p>
+    <w:p>
+      <w:pPr>
+        <w:pStyle w:val="PlainText"/>
+        <w:rPr>
+          <w:rFonts w:ascii="Times New Roman" w:eastAsia="Calibri" w:hAnsi="Times New Roman" w:cs="Times New Roman"/>
+          <w:bCs/>
+          <w:sz w:val="24"/>
+          <w:szCs w:val="24"/>
+        </w:rPr>
+      </w:pPr>
+    </w:p>
+    <w:p>
+      <w:pPr>
+        <w:pStyle w:val="PlainText"/>
+        <w:rPr>
+          <w:rFonts w:ascii="Times New Roman" w:eastAsia="Calibri" w:hAnsi="Times New Roman" w:cs="Times New Roman"/>
+          <w:bCs/>
+          <w:sz w:val="24"/>
+          <w:szCs w:val="24"/>
+        </w:rPr>
+      </w:pPr>
+      <w:r>
+        <w:rPr>
+          <w:rFonts w:ascii="Times New Roman" w:eastAsia="Calibri" w:hAnsi="Times New Roman" w:cs="Times New Roman"/>
+          <w:bCs/>
+          <w:sz w:val="24"/>
+          <w:szCs w:val="24"/>
+        </w:rPr>
+        <w:t>Take a screenshot of the application running at this point with a queen placed at 1, 1.</w:t>
+      </w:r>
+    </w:p>
+    <w:p>
+      <w:pPr>
+        <w:pStyle w:val="PlainText"/>
+        <w:rPr>
+          <w:rFonts w:ascii="Times New Roman" w:eastAsia="Calibri" w:hAnsi="Times New Roman" w:cs="Times New Roman"/>
+          <w:bCs/>
+          <w:sz w:val="24"/>
+          <w:szCs w:val="24"/>
+        </w:rPr>
+      </w:pPr>
+    </w:p>
+    <w:p>
+      <w:pPr>
+        <w:pStyle w:val="PlainText"/>
+        <w:rPr>
+          <w:rFonts w:ascii="Times New Roman" w:eastAsia="Calibri" w:hAnsi="Times New Roman" w:cs="Times New Roman"/>
+          <w:bCs/>
+          <w:sz w:val="24"/>
+          <w:szCs w:val="24"/>
+        </w:rPr>
+      </w:pPr>
+      <w:r>
+        <w:rPr>
+          <w:rFonts w:ascii="Times New Roman" w:eastAsia="Calibri" w:hAnsi="Times New Roman" w:cs="Times New Roman"/>
+          <w:bCs/>
+          <w:sz w:val="24"/>
+          <w:szCs w:val="24"/>
+        </w:rPr>
+        <w:drawing>
+          <wp:inline distT="0" distB="0" distL="0" distR="0" wp14:anchorId="2203ED99" wp14:editId="58ADC04F">
+            <wp:extent cx="5943600" cy="2996565"/>
+            <wp:effectExtent l="0" t="0" r="0" b="0"/>
+            <wp:docPr id="702172249" name="Picture 1"/>
+            <wp:cNvGraphicFramePr>
+              <a:graphicFrameLocks xmlns:a="http://schemas.openxmlformats.org/drawingml/2006/main" noChangeAspect="1"/>
+            </wp:cNvGraphicFramePr>
+            <a:graphic xmlns:a="http://schemas.openxmlformats.org/drawingml/2006/main">
+              <a:graphicData uri="http://schemas.openxmlformats.org/drawingml/2006/picture">
+                <pic:pic xmlns:pic="http://schemas.openxmlformats.org/drawingml/2006/picture">
+                  <pic:nvPicPr>
+                    <pic:cNvPr id="702172249" name=""/>
+                    <pic:cNvPicPr/>
+                  </pic:nvPicPr>
+                  <pic:blipFill>
+                    <a:blip r:embed="rId18"/>
+                    <a:stretch>
+                      <a:fillRect/>
+                    </a:stretch>
+                  </pic:blipFill>
+                  <pic:spPr>
+                    <a:xfrm>
+                      <a:off x="0" y="0"/>
+                      <a:ext cx="5943600" cy="2996565"/>
+                    </a:xfrm>
+                    <a:prstGeom prst="rect">
+                      <a:avLst/>
+                    </a:prstGeom>
+                  </pic:spPr>
+                </pic:pic>
+              </a:graphicData>
+            </a:graphic>
+          </wp:inline>
+        </w:drawing>
+      </w:r>
+    </w:p>
+    <w:p>
+      <w:pPr>
+        <w:pStyle w:val="PlainText"/>
+        <w:rPr>
+          <w:rFonts w:ascii="Times New Roman" w:eastAsia="Calibri" w:hAnsi="Times New Roman" w:cs="Times New Roman"/>
+          <w:bCs/>
+          <w:sz w:val="24"/>
+          <w:szCs w:val="24"/>
+        </w:rPr>
+      </w:pPr>
+    </w:p>
+    <w:p>
+      <w:pPr>
+        <w:pStyle w:val="PlainText"/>
+        <w:rPr>
+          <w:rFonts w:ascii="Times New Roman" w:eastAsia="Calibri" w:hAnsi="Times New Roman" w:cs="Times New Roman"/>
+          <w:bCs/>
+          <w:sz w:val="24"/>
+          <w:szCs w:val="24"/>
+        </w:rPr>
+      </w:pPr>
+      <w:r>
+        <w:rPr>
+          <w:rFonts w:ascii="Times New Roman" w:eastAsia="Calibri" w:hAnsi="Times New Roman" w:cs="Times New Roman"/>
+          <w:bCs/>
+          <w:sz w:val="24"/>
+          <w:szCs w:val="24"/>
+        </w:rPr>
+        <w:t xml:space="preserve">·Take a screenshot of the citations for </w:t>
+      </w:r>
+      <w:proofErr w:type="spellStart"/>
+      <w:r>
+        <w:rPr>
+          <w:rFonts w:ascii="Times New Roman" w:eastAsia="Calibri" w:hAnsi="Times New Roman" w:cs="Times New Roman"/>
+          <w:bCs/>
+          <w:sz w:val="24"/>
+          <w:szCs w:val="24"/>
+        </w:rPr>
+        <w:t>Program.cs</w:t>
+      </w:r>
+      <w:proofErr w:type="spellEnd"/>
+      <w:r>
+        <w:rPr>
+          <w:rFonts w:ascii="Times New Roman" w:eastAsia="Calibri" w:hAnsi="Times New Roman" w:cs="Times New Roman"/>
+          <w:bCs/>
+          <w:sz w:val="24"/>
+          <w:szCs w:val="24"/>
+        </w:rPr>
+        <w:t>.</w:t>
+      </w:r>
+    </w:p>
+    <w:p>
+      <w:pPr>
+        <w:pStyle w:val="PlainText"/>
+        <w:rPr>
+          <w:rFonts w:ascii="Times New Roman" w:eastAsia="Calibri" w:hAnsi="Times New Roman" w:cs="Times New Roman"/>
+          <w:bCs/>
+          <w:sz w:val="24"/>
+          <w:szCs w:val="24"/>
+        </w:rPr>
+      </w:pPr>
+      <w:r>
+        <w:rPr>
+          <w:rFonts w:ascii="Times New Roman" w:eastAsia="Calibri" w:hAnsi="Times New Roman" w:cs="Times New Roman"/>
+          <w:bCs/>
+          <w:sz w:val="24"/>
+          <w:szCs w:val="24"/>
+        </w:rPr>
+        <w:lastRenderedPageBreak/>
+        <w:drawing>
+          <wp:inline distT="0" distB="0" distL="0" distR="0" wp14:anchorId="43A31668" wp14:editId="629F6620">
+            <wp:extent cx="3019846" cy="1829055"/>
+            <wp:effectExtent l="0" t="0" r="9525" b="0"/>
+            <wp:docPr id="2138813151" name="Picture 1"/>
+            <wp:cNvGraphicFramePr>
+              <a:graphicFrameLocks xmlns:a="http://schemas.openxmlformats.org/drawingml/2006/main" noChangeAspect="1"/>
+            </wp:cNvGraphicFramePr>
+            <a:graphic xmlns:a="http://schemas.openxmlformats.org/drawingml/2006/main">
+              <a:graphicData uri="http://schemas.openxmlformats.org/drawingml/2006/picture">
+                <pic:pic xmlns:pic="http://schemas.openxmlformats.org/drawingml/2006/picture">
+                  <pic:nvPicPr>
+                    <pic:cNvPr id="2138813151" name=""/>
+                    <pic:cNvPicPr/>
+                  </pic:nvPicPr>
+                  <pic:blipFill>
+                    <a:blip r:embed="rId19"/>
+                    <a:stretch>
+                      <a:fillRect/>
+                    </a:stretch>
+                  </pic:blipFill>
+                  <pic:spPr>
+                    <a:xfrm>
+                      <a:off x="0" y="0"/>
+                      <a:ext cx="3019846" cy="1829055"/>
+                    </a:xfrm>
+                    <a:prstGeom prst="rect">
+                      <a:avLst/>
+                    </a:prstGeom>
+                  </pic:spPr>
+                </pic:pic>
+              </a:graphicData>
+            </a:graphic>
+          </wp:inline>
+        </w:drawing>
+      </w:r>
+    </w:p>
+    <w:p>
+      <w:pPr>
+        <w:pStyle w:val="PlainText"/>
+        <w:rPr>
+          <w:rFonts w:ascii="Times New Roman" w:eastAsia="Calibri" w:hAnsi="Times New Roman" w:cs="Times New Roman"/>
+          <w:bCs/>
+          <w:sz w:val="24"/>
+          <w:szCs w:val="24"/>
+        </w:rPr>
+      </w:pPr>
+    </w:p>
+    <w:p>
+      <w:pPr>
+        <w:pStyle w:val="PlainText"/>
+        <w:rPr>
+          <w:rFonts w:ascii="Times New Roman" w:eastAsia="Calibri" w:hAnsi="Times New Roman" w:cs="Times New Roman"/>
+          <w:bCs/>
+          <w:sz w:val="24"/>
+          <w:szCs w:val="24"/>
+        </w:rPr>
+      </w:pPr>
+      <w:r>
+        <w:rPr>
+          <w:rFonts w:ascii="Times New Roman" w:eastAsia="Calibri" w:hAnsi="Times New Roman" w:cs="Times New Roman"/>
+          <w:bCs/>
+          <w:sz w:val="24"/>
+          <w:szCs w:val="24"/>
+        </w:rPr>
+        <w:t xml:space="preserve">·Take a screenshot of the </w:t>
+      </w:r>
+      <w:proofErr w:type="spellStart"/>
+      <w:r>
+        <w:rPr>
+          <w:rFonts w:ascii="Times New Roman" w:eastAsia="Calibri" w:hAnsi="Times New Roman" w:cs="Times New Roman"/>
+          <w:bCs/>
+          <w:sz w:val="24"/>
+          <w:szCs w:val="24"/>
+        </w:rPr>
+        <w:t>PrintBoard</w:t>
+      </w:r>
+      <w:proofErr w:type="spellEnd"/>
+      <w:r>
+        <w:rPr>
+          <w:rFonts w:ascii="Times New Roman" w:eastAsia="Calibri" w:hAnsi="Times New Roman" w:cs="Times New Roman"/>
+          <w:bCs/>
+          <w:sz w:val="24"/>
+          <w:szCs w:val="24"/>
+        </w:rPr>
+        <w:t xml:space="preserve"> and </w:t>
+      </w:r>
+      <w:proofErr w:type="spellStart"/>
+      <w:r>
+        <w:rPr>
+          <w:rFonts w:ascii="Times New Roman" w:eastAsia="Calibri" w:hAnsi="Times New Roman" w:cs="Times New Roman"/>
+          <w:bCs/>
+          <w:sz w:val="24"/>
+          <w:szCs w:val="24"/>
+        </w:rPr>
+        <w:t>GetRowAndCol</w:t>
+      </w:r>
+      <w:proofErr w:type="spellEnd"/>
+      <w:r>
+        <w:rPr>
+          <w:rFonts w:ascii="Times New Roman" w:eastAsia="Calibri" w:hAnsi="Times New Roman" w:cs="Times New Roman"/>
+          <w:bCs/>
+          <w:sz w:val="24"/>
+          <w:szCs w:val="24"/>
+        </w:rPr>
+        <w:t xml:space="preserve"> methods in the Utility class.</w:t>
+      </w:r>
+    </w:p>
+    <w:p>
+      <w:pPr>
+        <w:pStyle w:val="PlainText"/>
+        <w:rPr>
+          <w:rFonts w:ascii="Times New Roman" w:eastAsia="Calibri" w:hAnsi="Times New Roman" w:cs="Times New Roman"/>
+          <w:bCs/>
+          <w:sz w:val="24"/>
+          <w:szCs w:val="24"/>
+        </w:rPr>
+      </w:pPr>
+      <w:r>
+        <w:rPr>
+          <w:rFonts w:ascii="Times New Roman" w:eastAsia="Calibri" w:hAnsi="Times New Roman" w:cs="Times New Roman"/>
+          <w:bCs/>
+          <w:sz w:val="24"/>
+          <w:szCs w:val="24"/>
+        </w:rPr>
+        <w:drawing>
+          <wp:inline distT="0" distB="0" distL="0" distR="0" wp14:anchorId="0FF1F5C6" wp14:editId="506E6E31">
+            <wp:extent cx="4458322" cy="4372585"/>
+            <wp:effectExtent l="0" t="0" r="0" b="9525"/>
+            <wp:docPr id="88878920" name="Picture 1"/>
+            <wp:cNvGraphicFramePr>
+              <a:graphicFrameLocks xmlns:a="http://schemas.openxmlformats.org/drawingml/2006/main" noChangeAspect="1"/>
+            </wp:cNvGraphicFramePr>
+            <a:graphic xmlns:a="http://schemas.openxmlformats.org/drawingml/2006/main">
+              <a:graphicData uri="http://schemas.openxmlformats.org/drawingml/2006/picture">
+                <pic:pic xmlns:pic="http://schemas.openxmlformats.org/drawingml/2006/picture">
+                  <pic:nvPicPr>
+                    <pic:cNvPr id="88878920" name=""/>
+                    <pic:cNvPicPr/>
+                  </pic:nvPicPr>
+                  <pic:blipFill>
+                    <a:blip r:embed="rId20"/>
+                    <a:stretch>
+                      <a:fillRect/>
+                    </a:stretch>
+                  </pic:blipFill>
+                  <pic:spPr>
+                    <a:xfrm>
+                      <a:off x="0" y="0"/>
+                      <a:ext cx="4458322" cy="4372585"/>
+                    </a:xfrm>
+                    <a:prstGeom prst="rect">
+                      <a:avLst/>
+                    </a:prstGeom>
+                  </pic:spPr>
+                </pic:pic>
+              </a:graphicData>
+            </a:graphic>
+          </wp:inline>
+        </w:drawing>
+      </w:r>
+    </w:p>
+    <w:p>
+      <w:pPr>
+        <w:pStyle w:val="PlainText"/>
+        <w:rPr>
+          <w:rFonts w:ascii="Times New Roman" w:eastAsia="Calibri" w:hAnsi="Times New Roman" w:cs="Times New Roman"/>
+          <w:bCs/>
+          <w:sz w:val="24"/>
+          <w:szCs w:val="24"/>
+        </w:rPr>
+      </w:pPr>
+    </w:p>
+    <w:p>
+      <w:pPr>
+        <w:pStyle w:val="PlainText"/>
+        <w:rPr>
+          <w:rFonts w:ascii="Times New Roman" w:eastAsia="Calibri" w:hAnsi="Times New Roman" w:cs="Times New Roman"/>
+          <w:bCs/>
+          <w:sz w:val="24"/>
+          <w:szCs w:val="24"/>
+        </w:rPr>
+      </w:pPr>
+      <w:r>
+        <w:rPr>
+          <w:rFonts w:ascii="Times New Roman" w:eastAsia="Calibri" w:hAnsi="Times New Roman" w:cs="Times New Roman"/>
+          <w:bCs/>
+          <w:sz w:val="24"/>
+          <w:szCs w:val="24"/>
+        </w:rPr>
+        <w:lastRenderedPageBreak/>
+        <w:drawing>
+          <wp:inline distT="0" distB="0" distL="0" distR="0" wp14:anchorId="6607A0FD" wp14:editId="4DB7FB93">
+            <wp:extent cx="4763165" cy="2114845"/>
+            <wp:effectExtent l="0" t="0" r="0" b="0"/>
+            <wp:docPr id="1237260329" name="Picture 1"/>
+            <wp:cNvGraphicFramePr>
+              <a:graphicFrameLocks xmlns:a="http://schemas.openxmlformats.org/drawingml/2006/main" noChangeAspect="1"/>
+            </wp:cNvGraphicFramePr>
+            <a:graphic xmlns:a="http://schemas.openxmlformats.org/drawingml/2006/main">
+              <a:graphicData uri="http://schemas.openxmlformats.org/drawingml/2006/picture">
+                <pic:pic xmlns:pic="http://schemas.openxmlformats.org/drawingml/2006/picture">
+                  <pic:nvPicPr>
+                    <pic:cNvPr id="1237260329" name=""/>
+                    <pic:cNvPicPr/>
+                  </pic:nvPicPr>
+                  <pic:blipFill>
+                    <a:blip r:embed="rId21"/>
+                    <a:stretch>
+                      <a:fillRect/>
+                    </a:stretch>
+                  </pic:blipFill>
+                  <pic:spPr>
+                    <a:xfrm>
+                      <a:off x="0" y="0"/>
+                      <a:ext cx="4763165" cy="2114845"/>
+                    </a:xfrm>
+                    <a:prstGeom prst="rect">
+                      <a:avLst/>
+                    </a:prstGeom>
+                  </pic:spPr>
+                </pic:pic>
+              </a:graphicData>
+            </a:graphic>
+          </wp:inline>
+        </w:drawing>
+      </w:r>
+    </w:p>
+    <w:p>
+      <w:pPr>
+        <w:pStyle w:val="PlainText"/>
+        <w:rPr>
+          <w:rFonts w:ascii="Times New Roman" w:eastAsia="Calibri" w:hAnsi="Times New Roman" w:cs="Times New Roman"/>
+          <w:bCs/>
+          <w:sz w:val="24"/>
+          <w:szCs w:val="24"/>
+        </w:rPr>
+      </w:pPr>
+    </w:p>
+    <w:p>
+      <w:pPr>
+        <w:pStyle w:val="PlainText"/>
+        <w:rPr>
+          <w:rFonts w:ascii="Times New Roman" w:eastAsia="Calibri" w:hAnsi="Times New Roman" w:cs="Times New Roman"/>
+          <w:bCs/>
+          <w:sz w:val="24"/>
+          <w:szCs w:val="24"/>
+        </w:rPr>
+      </w:pPr>
+      <w:r>
+        <w:rPr>
+          <w:rFonts w:ascii="Times New Roman" w:eastAsia="Calibri" w:hAnsi="Times New Roman" w:cs="Times New Roman"/>
+          <w:bCs/>
+          <w:sz w:val="24"/>
+          <w:szCs w:val="24"/>
+        </w:rPr>
+        <w:t>Console App Challenges</w:t>
+      </w:r>
+    </w:p>
+    <w:p>
+      <w:pPr>
+        <w:pStyle w:val="PlainText"/>
+        <w:rPr>
+          <w:rFonts w:ascii="Times New Roman" w:eastAsia="Calibri" w:hAnsi="Times New Roman" w:cs="Times New Roman"/>
+          <w:bCs/>
+          <w:sz w:val="24"/>
+          <w:szCs w:val="24"/>
+        </w:rPr>
+      </w:pPr>
+    </w:p>
+    <w:p>
+      <w:pPr>
+        <w:pStyle w:val="PlainText"/>
+        <w:rPr>
+          <w:rFonts w:ascii="Times New Roman" w:eastAsia="Calibri" w:hAnsi="Times New Roman" w:cs="Times New Roman"/>
+          <w:bCs/>
+          <w:sz w:val="24"/>
+          <w:szCs w:val="24"/>
+        </w:rPr>
+      </w:pPr>
+      <w:r>
+        <w:rPr>
+          <w:rFonts w:ascii="Times New Roman" w:eastAsia="Calibri" w:hAnsi="Times New Roman" w:cs="Times New Roman"/>
+          <w:bCs/>
+          <w:sz w:val="24"/>
+          <w:szCs w:val="24"/>
+        </w:rPr>
+        <w:t>The program works but is not yet finished. Here are some things you need to complete:</w:t>
+      </w:r>
+    </w:p>
+    <w:p>
+      <w:pPr>
+        <w:pStyle w:val="PlainText"/>
+        <w:rPr>
+          <w:rFonts w:ascii="Times New Roman" w:eastAsia="Calibri" w:hAnsi="Times New Roman" w:cs="Times New Roman"/>
+          <w:bCs/>
+          <w:sz w:val="24"/>
+          <w:szCs w:val="24"/>
+        </w:rPr>
+      </w:pPr>
+      <w:r>
+        <w:rPr>
+          <w:rFonts w:ascii="Times New Roman" w:eastAsia="Calibri" w:hAnsi="Times New Roman" w:cs="Times New Roman"/>
+          <w:bCs/>
+          <w:sz w:val="24"/>
+          <w:szCs w:val="24"/>
+        </w:rPr>
+        <w:t>1. Fix Out-of-Bounds Errors – Make sure that the user does not enter a number that is smaller or larger than the size of the grid.</w:t>
+      </w:r>
+    </w:p>
+    <w:p>
+      <w:pPr>
+        <w:pStyle w:val="PlainText"/>
+        <w:rPr>
+          <w:rFonts w:ascii="Times New Roman" w:eastAsia="Calibri" w:hAnsi="Times New Roman" w:cs="Times New Roman"/>
+          <w:bCs/>
+          <w:sz w:val="24"/>
+          <w:szCs w:val="24"/>
+        </w:rPr>
+      </w:pPr>
+      <w:r>
+        <w:rPr>
+          <w:rFonts w:ascii="Times New Roman" w:eastAsia="Calibri" w:hAnsi="Times New Roman" w:cs="Times New Roman"/>
+          <w:bCs/>
+          <w:sz w:val="24"/>
+          <w:szCs w:val="24"/>
+        </w:rPr>
+        <w:t>2. Fix Input Errors – The user is supposed to type in various information about the location and type of chess piece. If the user tries to put in letters or numbers outside of the acceptable options, the program will crash. Verify the input from the user before proceeding with the rest of the program.</w:t>
+      </w:r>
+    </w:p>
+    <w:p>
+      <w:pPr>
+        <w:pStyle w:val="PlainText"/>
+        <w:rPr>
+          <w:rFonts w:ascii="Times New Roman" w:eastAsia="Calibri" w:hAnsi="Times New Roman" w:cs="Times New Roman"/>
+          <w:bCs/>
+          <w:sz w:val="24"/>
+          <w:szCs w:val="24"/>
+        </w:rPr>
+      </w:pPr>
+      <w:r>
+        <w:rPr>
+          <w:rFonts w:ascii="Times New Roman" w:eastAsia="Calibri" w:hAnsi="Times New Roman" w:cs="Times New Roman"/>
+          <w:bCs/>
+          <w:sz w:val="24"/>
+          <w:szCs w:val="24"/>
+        </w:rPr>
+        <w:t>3. Board Printing Outlines – The program shows only a single character for each board cell. Modify the output to print a board outline like the example shown here in Figure 46. This shows outlines for each square, column headers, and row numbers.</w:t>
       </w:r>
     </w:p>
     <w:p>

</xml_diff>

<commit_message>
Create the CellModel and BoardModel classes
</commit_message>
<xml_diff>
--- a/Activity 2.docx
+++ b/Activity 2.docx
@@ -192,182 +192,205 @@
     <w:p>
       <w:pPr>
         <w:rPr>
-          <w:sz w:val="24"/>
-          <w:szCs w:val="24"/>
-        </w:rPr>
-      </w:pPr>
-    </w:p>
-    <w:p>
-      <w:pPr>
-        <w:rPr>
-          <w:sz w:val="24"/>
-          <w:szCs w:val="24"/>
-        </w:rPr>
-      </w:pPr>
-    </w:p>
-    <w:p>
-      <w:pPr>
-        <w:rPr>
-          <w:sz w:val="24"/>
-          <w:szCs w:val="24"/>
-        </w:rPr>
-      </w:pPr>
-    </w:p>
-    <w:p>
-      <w:pPr>
-        <w:rPr>
-          <w:sz w:val="24"/>
-          <w:szCs w:val="24"/>
-        </w:rPr>
-      </w:pPr>
-    </w:p>
-    <w:p>
-      <w:pPr>
-        <w:rPr>
-          <w:sz w:val="24"/>
-          <w:szCs w:val="24"/>
-        </w:rPr>
-      </w:pPr>
-    </w:p>
-    <w:p>
-      <w:pPr>
-        <w:rPr>
-          <w:sz w:val="24"/>
-          <w:szCs w:val="24"/>
-        </w:rPr>
-      </w:pPr>
-    </w:p>
-    <w:p>
-      <w:pPr>
-        <w:rPr>
-          <w:sz w:val="24"/>
-          <w:szCs w:val="24"/>
-        </w:rPr>
-      </w:pPr>
-    </w:p>
-    <w:p>
-      <w:pPr>
-        <w:rPr>
-          <w:sz w:val="24"/>
-          <w:szCs w:val="24"/>
-        </w:rPr>
-      </w:pPr>
-    </w:p>
-    <w:p>
-      <w:pPr>
-        <w:rPr>
-          <w:sz w:val="24"/>
-          <w:szCs w:val="24"/>
-        </w:rPr>
-      </w:pPr>
-    </w:p>
-    <w:p>
-      <w:pPr>
-        <w:rPr>
-          <w:sz w:val="24"/>
-          <w:szCs w:val="24"/>
-        </w:rPr>
-      </w:pPr>
-    </w:p>
-    <w:p>
-      <w:pPr>
-        <w:rPr>
-          <w:sz w:val="24"/>
-          <w:szCs w:val="24"/>
-        </w:rPr>
-      </w:pPr>
-    </w:p>
-    <w:p>
-      <w:pPr>
-        <w:rPr>
-          <w:sz w:val="24"/>
-          <w:szCs w:val="24"/>
-        </w:rPr>
-      </w:pPr>
-    </w:p>
-    <w:p>
-      <w:pPr>
-        <w:rPr>
-          <w:sz w:val="24"/>
-          <w:szCs w:val="24"/>
-        </w:rPr>
-      </w:pPr>
-    </w:p>
-    <w:p>
-      <w:pPr>
-        <w:rPr>
-          <w:sz w:val="24"/>
-          <w:szCs w:val="24"/>
-        </w:rPr>
-      </w:pPr>
-    </w:p>
-    <w:p>
-      <w:pPr>
-        <w:rPr>
-          <w:sz w:val="24"/>
-          <w:szCs w:val="24"/>
-        </w:rPr>
-      </w:pPr>
-    </w:p>
-    <w:p>
-      <w:pPr>
-        <w:rPr>
-          <w:sz w:val="24"/>
-          <w:szCs w:val="24"/>
-        </w:rPr>
-      </w:pPr>
-    </w:p>
-    <w:p>
-      <w:pPr>
-        <w:rPr>
-          <w:sz w:val="24"/>
-          <w:szCs w:val="24"/>
-        </w:rPr>
-      </w:pPr>
-    </w:p>
-    <w:p>
-      <w:pPr>
-        <w:rPr>
-          <w:sz w:val="24"/>
-          <w:szCs w:val="24"/>
-        </w:rPr>
-      </w:pPr>
-    </w:p>
-    <w:p>
-      <w:pPr>
-        <w:rPr>
-          <w:sz w:val="24"/>
-          <w:szCs w:val="24"/>
-        </w:rPr>
-      </w:pPr>
-    </w:p>
-    <w:p>
-      <w:pPr>
-        <w:rPr>
-          <w:sz w:val="24"/>
-          <w:szCs w:val="24"/>
-        </w:rPr>
-      </w:pPr>
-    </w:p>
-    <w:p>
-      <w:pPr>
-        <w:rPr>
-          <w:sz w:val="24"/>
-          <w:szCs w:val="24"/>
-        </w:rPr>
-      </w:pPr>
-    </w:p>
-    <w:p>
-      <w:pPr>
-        <w:rPr>
-          <w:sz w:val="24"/>
-          <w:szCs w:val="24"/>
-        </w:rPr>
-      </w:pPr>
-    </w:p>
-    <w:p>
-      <w:pPr>
-        <w:rPr>
+          <w:rFonts w:ascii="Times New Roman" w:hAnsi="Times New Roman" w:cs="Times New Roman"/>
+          <w:sz w:val="24"/>
+          <w:szCs w:val="24"/>
+        </w:rPr>
+      </w:pPr>
+    </w:p>
+    <w:p>
+      <w:pPr>
+        <w:rPr>
+          <w:rFonts w:ascii="Times New Roman" w:hAnsi="Times New Roman" w:cs="Times New Roman"/>
+          <w:sz w:val="24"/>
+          <w:szCs w:val="24"/>
+        </w:rPr>
+      </w:pPr>
+    </w:p>
+    <w:p>
+      <w:pPr>
+        <w:rPr>
+          <w:rFonts w:ascii="Times New Roman" w:hAnsi="Times New Roman" w:cs="Times New Roman"/>
+          <w:sz w:val="24"/>
+          <w:szCs w:val="24"/>
+        </w:rPr>
+      </w:pPr>
+    </w:p>
+    <w:p>
+      <w:pPr>
+        <w:rPr>
+          <w:rFonts w:ascii="Times New Roman" w:hAnsi="Times New Roman" w:cs="Times New Roman"/>
+          <w:sz w:val="24"/>
+          <w:szCs w:val="24"/>
+        </w:rPr>
+      </w:pPr>
+    </w:p>
+    <w:p>
+      <w:pPr>
+        <w:rPr>
+          <w:rFonts w:ascii="Times New Roman" w:hAnsi="Times New Roman" w:cs="Times New Roman"/>
+          <w:sz w:val="24"/>
+          <w:szCs w:val="24"/>
+        </w:rPr>
+      </w:pPr>
+    </w:p>
+    <w:p>
+      <w:pPr>
+        <w:rPr>
+          <w:rFonts w:ascii="Times New Roman" w:hAnsi="Times New Roman" w:cs="Times New Roman"/>
+          <w:sz w:val="24"/>
+          <w:szCs w:val="24"/>
+        </w:rPr>
+      </w:pPr>
+    </w:p>
+    <w:p>
+      <w:pPr>
+        <w:rPr>
+          <w:rFonts w:ascii="Times New Roman" w:hAnsi="Times New Roman" w:cs="Times New Roman"/>
+          <w:sz w:val="24"/>
+          <w:szCs w:val="24"/>
+        </w:rPr>
+      </w:pPr>
+    </w:p>
+    <w:p>
+      <w:pPr>
+        <w:rPr>
+          <w:rFonts w:ascii="Times New Roman" w:hAnsi="Times New Roman" w:cs="Times New Roman"/>
+          <w:sz w:val="24"/>
+          <w:szCs w:val="24"/>
+        </w:rPr>
+      </w:pPr>
+    </w:p>
+    <w:p>
+      <w:pPr>
+        <w:rPr>
+          <w:rFonts w:ascii="Times New Roman" w:hAnsi="Times New Roman" w:cs="Times New Roman"/>
+          <w:sz w:val="24"/>
+          <w:szCs w:val="24"/>
+        </w:rPr>
+      </w:pPr>
+    </w:p>
+    <w:p>
+      <w:pPr>
+        <w:rPr>
+          <w:rFonts w:ascii="Times New Roman" w:hAnsi="Times New Roman" w:cs="Times New Roman"/>
+          <w:sz w:val="24"/>
+          <w:szCs w:val="24"/>
+        </w:rPr>
+      </w:pPr>
+    </w:p>
+    <w:p>
+      <w:pPr>
+        <w:rPr>
+          <w:rFonts w:ascii="Times New Roman" w:hAnsi="Times New Roman" w:cs="Times New Roman"/>
+          <w:sz w:val="24"/>
+          <w:szCs w:val="24"/>
+        </w:rPr>
+      </w:pPr>
+    </w:p>
+    <w:p>
+      <w:pPr>
+        <w:rPr>
+          <w:rFonts w:ascii="Times New Roman" w:hAnsi="Times New Roman" w:cs="Times New Roman"/>
+          <w:sz w:val="24"/>
+          <w:szCs w:val="24"/>
+        </w:rPr>
+      </w:pPr>
+    </w:p>
+    <w:p>
+      <w:pPr>
+        <w:rPr>
+          <w:rFonts w:ascii="Times New Roman" w:hAnsi="Times New Roman" w:cs="Times New Roman"/>
+          <w:sz w:val="24"/>
+          <w:szCs w:val="24"/>
+        </w:rPr>
+      </w:pPr>
+    </w:p>
+    <w:p>
+      <w:pPr>
+        <w:rPr>
+          <w:rFonts w:ascii="Times New Roman" w:hAnsi="Times New Roman" w:cs="Times New Roman"/>
+          <w:sz w:val="24"/>
+          <w:szCs w:val="24"/>
+        </w:rPr>
+      </w:pPr>
+    </w:p>
+    <w:p>
+      <w:pPr>
+        <w:rPr>
+          <w:rFonts w:ascii="Times New Roman" w:hAnsi="Times New Roman" w:cs="Times New Roman"/>
+          <w:sz w:val="24"/>
+          <w:szCs w:val="24"/>
+        </w:rPr>
+      </w:pPr>
+    </w:p>
+    <w:p>
+      <w:pPr>
+        <w:rPr>
+          <w:rFonts w:ascii="Times New Roman" w:hAnsi="Times New Roman" w:cs="Times New Roman"/>
+          <w:sz w:val="24"/>
+          <w:szCs w:val="24"/>
+        </w:rPr>
+      </w:pPr>
+    </w:p>
+    <w:p>
+      <w:pPr>
+        <w:rPr>
+          <w:rFonts w:ascii="Times New Roman" w:hAnsi="Times New Roman" w:cs="Times New Roman"/>
+          <w:sz w:val="24"/>
+          <w:szCs w:val="24"/>
+        </w:rPr>
+      </w:pPr>
+    </w:p>
+    <w:p>
+      <w:pPr>
+        <w:rPr>
+          <w:rFonts w:ascii="Times New Roman" w:hAnsi="Times New Roman" w:cs="Times New Roman"/>
+          <w:sz w:val="24"/>
+          <w:szCs w:val="24"/>
+        </w:rPr>
+      </w:pPr>
+    </w:p>
+    <w:p>
+      <w:pPr>
+        <w:rPr>
+          <w:rFonts w:ascii="Times New Roman" w:hAnsi="Times New Roman" w:cs="Times New Roman"/>
+          <w:sz w:val="24"/>
+          <w:szCs w:val="24"/>
+        </w:rPr>
+      </w:pPr>
+    </w:p>
+    <w:p>
+      <w:pPr>
+        <w:rPr>
+          <w:rFonts w:ascii="Times New Roman" w:hAnsi="Times New Roman" w:cs="Times New Roman"/>
+          <w:sz w:val="24"/>
+          <w:szCs w:val="24"/>
+        </w:rPr>
+      </w:pPr>
+    </w:p>
+    <w:p>
+      <w:pPr>
+        <w:rPr>
+          <w:rFonts w:ascii="Times New Roman" w:hAnsi="Times New Roman" w:cs="Times New Roman"/>
+          <w:sz w:val="24"/>
+          <w:szCs w:val="24"/>
+        </w:rPr>
+      </w:pPr>
+    </w:p>
+    <w:p>
+      <w:pPr>
+        <w:rPr>
+          <w:rFonts w:ascii="Times New Roman" w:hAnsi="Times New Roman" w:cs="Times New Roman"/>
+          <w:sz w:val="24"/>
+          <w:szCs w:val="24"/>
+        </w:rPr>
+      </w:pPr>
+    </w:p>
+    <w:p>
+      <w:pPr>
+        <w:rPr>
+          <w:rFonts w:ascii="Times New Roman" w:hAnsi="Times New Roman" w:cs="Times New Roman"/>
           <w:b/>
           <w:bCs/>
           <w:sz w:val="28"/>
@@ -376,16 +399,17 @@
       </w:pPr>
       <w:r>
         <w:rPr>
+          <w:rFonts w:ascii="Times New Roman" w:hAnsi="Times New Roman" w:cs="Times New Roman"/>
           <w:b/>
           <w:bCs/>
           <w:sz w:val="28"/>
           <w:szCs w:val="28"/>
         </w:rPr>
-        <w:lastRenderedPageBreak/>
         <w:t xml:space="preserve">Activity </w:t>
       </w:r>
       <w:r>
         <w:rPr>
+          <w:rFonts w:ascii="Times New Roman" w:hAnsi="Times New Roman" w:cs="Times New Roman"/>
           <w:b/>
           <w:bCs/>
           <w:sz w:val="28"/>
@@ -397,14 +421,16 @@
     <w:p>
       <w:pPr>
         <w:rPr>
-          <w:sz w:val="24"/>
-          <w:szCs w:val="24"/>
-        </w:rPr>
-      </w:pPr>
-    </w:p>
-    <w:p>
-      <w:pPr>
-        <w:rPr>
+          <w:rFonts w:ascii="Times New Roman" w:hAnsi="Times New Roman" w:cs="Times New Roman"/>
+          <w:sz w:val="24"/>
+          <w:szCs w:val="24"/>
+        </w:rPr>
+      </w:pPr>
+    </w:p>
+    <w:p>
+      <w:pPr>
+        <w:rPr>
+          <w:rFonts w:ascii="Times New Roman" w:hAnsi="Times New Roman" w:cs="Times New Roman"/>
           <w:sz w:val="24"/>
           <w:szCs w:val="24"/>
         </w:rPr>
@@ -412,6 +438,7 @@
       <w:proofErr w:type="spellStart"/>
       <w:r>
         <w:rPr>
+          <w:rFonts w:ascii="Times New Roman" w:hAnsi="Times New Roman" w:cs="Times New Roman"/>
           <w:b/>
           <w:bCs/>
           <w:sz w:val="24"/>
@@ -422,6 +449,7 @@
       <w:proofErr w:type="spellEnd"/>
       <w:r>
         <w:rPr>
+          <w:rFonts w:ascii="Times New Roman" w:hAnsi="Times New Roman" w:cs="Times New Roman"/>
           <w:b/>
           <w:bCs/>
           <w:sz w:val="24"/>
@@ -431,6 +459,7 @@
       </w:r>
       <w:r>
         <w:rPr>
+          <w:rFonts w:ascii="Times New Roman" w:hAnsi="Times New Roman" w:cs="Times New Roman"/>
           <w:sz w:val="24"/>
           <w:szCs w:val="24"/>
         </w:rPr>
@@ -440,14 +469,16 @@
     <w:p>
       <w:pPr>
         <w:rPr>
-          <w:sz w:val="24"/>
-          <w:szCs w:val="24"/>
-        </w:rPr>
-      </w:pPr>
-      <w:hyperlink r:id="rId5" w:history="1">
+          <w:rFonts w:ascii="Times New Roman" w:hAnsi="Times New Roman" w:cs="Times New Roman"/>
+          <w:sz w:val="24"/>
+          <w:szCs w:val="24"/>
+        </w:rPr>
+      </w:pPr>
+      <w:hyperlink r:id="rId6" w:history="1">
         <w:r>
           <w:rPr>
             <w:rStyle w:val="Hyperlink"/>
+            <w:rFonts w:ascii="Times New Roman" w:hAnsi="Times New Roman" w:cs="Times New Roman"/>
             <w:sz w:val="24"/>
             <w:szCs w:val="24"/>
           </w:rPr>
@@ -458,6 +489,7 @@
     <w:p>
       <w:pPr>
         <w:rPr>
+          <w:rFonts w:ascii="Times New Roman" w:hAnsi="Times New Roman" w:cs="Times New Roman"/>
           <w:b/>
           <w:bCs/>
           <w:sz w:val="24"/>
@@ -468,6 +500,7 @@
     <w:p>
       <w:pPr>
         <w:rPr>
+          <w:rFonts w:ascii="Times New Roman" w:hAnsi="Times New Roman" w:cs="Times New Roman"/>
           <w:b/>
           <w:bCs/>
           <w:sz w:val="24"/>
@@ -476,59 +509,59 @@
       </w:pPr>
       <w:r>
         <w:rPr>
+          <w:rFonts w:ascii="Times New Roman" w:hAnsi="Times New Roman" w:cs="Times New Roman"/>
           <w:b/>
           <w:bCs/>
           <w:sz w:val="24"/>
           <w:szCs w:val="24"/>
         </w:rPr>
-        <w:t xml:space="preserve">Part </w:t>
-      </w:r>
-      <w:r>
-        <w:rPr>
-          <w:b/>
-          <w:bCs/>
-          <w:sz w:val="24"/>
-          <w:szCs w:val="24"/>
-        </w:rPr>
-        <w:t>1</w:t>
-      </w:r>
-      <w:r>
-        <w:rPr>
-          <w:b/>
-          <w:bCs/>
-          <w:sz w:val="24"/>
-          <w:szCs w:val="24"/>
-        </w:rPr>
-        <w:t>.</w:t>
-      </w:r>
-    </w:p>
-    <w:p>
-      <w:pPr>
-        <w:rPr>
-          <w:b/>
-          <w:bCs/>
-          <w:sz w:val="24"/>
-          <w:szCs w:val="24"/>
-        </w:rPr>
-      </w:pPr>
-    </w:p>
-    <w:p>
-      <w:pPr>
-        <w:rPr>
-          <w:sz w:val="24"/>
-          <w:szCs w:val="24"/>
-        </w:rPr>
-      </w:pPr>
-      <w:r>
-        <w:rPr>
-          <w:sz w:val="24"/>
-          <w:szCs w:val="24"/>
-        </w:rPr>
-        <w:t xml:space="preserve">·Take a screenshot of the citations for </w:t>
+        <w:t>Part 1.</w:t>
+      </w:r>
+    </w:p>
+    <w:p>
+      <w:pPr>
+        <w:rPr>
+          <w:rFonts w:ascii="Times New Roman" w:hAnsi="Times New Roman" w:cs="Times New Roman"/>
+          <w:sz w:val="24"/>
+          <w:szCs w:val="24"/>
+        </w:rPr>
+      </w:pPr>
+      <w:r>
+        <w:rPr>
+          <w:rFonts w:ascii="Times New Roman" w:hAnsi="Times New Roman" w:cs="Times New Roman"/>
+          <w:sz w:val="24"/>
+          <w:szCs w:val="24"/>
+        </w:rPr>
+        <w:t>Below are the</w:t>
+      </w:r>
+      <w:r>
+        <w:rPr>
+          <w:rFonts w:ascii="Times New Roman" w:hAnsi="Times New Roman" w:cs="Times New Roman"/>
+          <w:sz w:val="24"/>
+          <w:szCs w:val="24"/>
+        </w:rPr>
+        <w:t xml:space="preserve"> screenshot</w:t>
+      </w:r>
+      <w:r>
+        <w:rPr>
+          <w:rFonts w:ascii="Times New Roman" w:hAnsi="Times New Roman" w:cs="Times New Roman"/>
+          <w:sz w:val="24"/>
+          <w:szCs w:val="24"/>
+        </w:rPr>
+        <w:t>s</w:t>
+      </w:r>
+      <w:r>
+        <w:rPr>
+          <w:rFonts w:ascii="Times New Roman" w:hAnsi="Times New Roman" w:cs="Times New Roman"/>
+          <w:sz w:val="24"/>
+          <w:szCs w:val="24"/>
+        </w:rPr>
+        <w:t xml:space="preserve"> of the citations for </w:t>
       </w:r>
       <w:proofErr w:type="spellStart"/>
       <w:r>
         <w:rPr>
+          <w:rFonts w:ascii="Times New Roman" w:hAnsi="Times New Roman" w:cs="Times New Roman"/>
           <w:sz w:val="24"/>
           <w:szCs w:val="24"/>
         </w:rPr>
@@ -537,6 +570,7 @@
       <w:proofErr w:type="spellEnd"/>
       <w:r>
         <w:rPr>
+          <w:rFonts w:ascii="Times New Roman" w:hAnsi="Times New Roman" w:cs="Times New Roman"/>
           <w:sz w:val="24"/>
           <w:szCs w:val="24"/>
         </w:rPr>
@@ -545,6 +579,7 @@
       <w:proofErr w:type="spellStart"/>
       <w:r>
         <w:rPr>
+          <w:rFonts w:ascii="Times New Roman" w:hAnsi="Times New Roman" w:cs="Times New Roman"/>
           <w:sz w:val="24"/>
           <w:szCs w:val="24"/>
         </w:rPr>
@@ -553,6 +588,7 @@
       <w:proofErr w:type="spellEnd"/>
       <w:r>
         <w:rPr>
+          <w:rFonts w:ascii="Times New Roman" w:hAnsi="Times New Roman" w:cs="Times New Roman"/>
           <w:sz w:val="24"/>
           <w:szCs w:val="24"/>
         </w:rPr>
@@ -561,6 +597,7 @@
       <w:proofErr w:type="spellStart"/>
       <w:r>
         <w:rPr>
+          <w:rFonts w:ascii="Times New Roman" w:hAnsi="Times New Roman" w:cs="Times New Roman"/>
           <w:sz w:val="24"/>
           <w:szCs w:val="24"/>
         </w:rPr>
@@ -569,15 +606,17 @@
       <w:proofErr w:type="spellEnd"/>
       <w:r>
         <w:rPr>
-          <w:sz w:val="24"/>
-          <w:szCs w:val="24"/>
-        </w:rPr>
-        <w:t>. Make sure to include the class declarations in the images.</w:t>
-      </w:r>
-    </w:p>
-    <w:p>
-      <w:pPr>
-        <w:rPr>
+          <w:rFonts w:ascii="Times New Roman" w:hAnsi="Times New Roman" w:cs="Times New Roman"/>
+          <w:sz w:val="24"/>
+          <w:szCs w:val="24"/>
+        </w:rPr>
+        <w:t xml:space="preserve">. </w:t>
+      </w:r>
+    </w:p>
+    <w:p>
+      <w:pPr>
+        <w:rPr>
+          <w:rFonts w:ascii="Times New Roman" w:hAnsi="Times New Roman" w:cs="Times New Roman"/>
           <w:b/>
           <w:bCs/>
           <w:sz w:val="24"/>
@@ -618,7 +657,7 @@
                     <pic:cNvPicPr/>
                   </pic:nvPicPr>
                   <pic:blipFill>
-                    <a:blip r:embed="rId6"/>
+                    <a:blip r:embed="rId7"/>
                     <a:stretch>
                       <a:fillRect/>
                     </a:stretch>
@@ -683,7 +722,7 @@
                     <pic:cNvPicPr/>
                   </pic:nvPicPr>
                   <pic:blipFill>
-                    <a:blip r:embed="rId7"/>
+                    <a:blip r:embed="rId8"/>
                     <a:stretch>
                       <a:fillRect/>
                     </a:stretch>
@@ -743,7 +782,6 @@
           <w:sz w:val="24"/>
           <w:szCs w:val="24"/>
         </w:rPr>
-        <w:lastRenderedPageBreak/>
         <w:drawing>
           <wp:inline distT="0" distB="0" distL="0" distR="0" wp14:anchorId="586669EB" wp14:editId="2F826EED">
             <wp:extent cx="3625850" cy="1506013"/>
@@ -760,7 +798,7 @@
                     <pic:cNvPicPr/>
                   </pic:nvPicPr>
                   <pic:blipFill>
-                    <a:blip r:embed="rId8"/>
+                    <a:blip r:embed="rId9"/>
                     <a:stretch>
                       <a:fillRect/>
                     </a:stretch>
@@ -795,20 +833,66 @@
     <w:p>
       <w:pPr>
         <w:rPr>
-          <w:sz w:val="24"/>
-          <w:szCs w:val="24"/>
-        </w:rPr>
-      </w:pPr>
-      <w:r>
-        <w:rPr>
-          <w:sz w:val="24"/>
-          <w:szCs w:val="24"/>
-        </w:rPr>
-        <w:t xml:space="preserve">·Take a screenshot of the </w:t>
+          <w:rFonts w:ascii="Times New Roman" w:hAnsi="Times New Roman" w:cs="Times New Roman"/>
+          <w:sz w:val="24"/>
+          <w:szCs w:val="24"/>
+        </w:rPr>
+      </w:pPr>
+    </w:p>
+    <w:p>
+      <w:pPr>
+        <w:rPr>
+          <w:rFonts w:ascii="Times New Roman" w:hAnsi="Times New Roman" w:cs="Times New Roman"/>
+          <w:sz w:val="24"/>
+          <w:szCs w:val="24"/>
+        </w:rPr>
+      </w:pPr>
+    </w:p>
+    <w:p>
+      <w:pPr>
+        <w:rPr>
+          <w:rFonts w:ascii="Times New Roman" w:hAnsi="Times New Roman" w:cs="Times New Roman"/>
+          <w:sz w:val="24"/>
+          <w:szCs w:val="24"/>
+        </w:rPr>
+      </w:pPr>
+      <w:r>
+        <w:rPr>
+          <w:rFonts w:ascii="Times New Roman" w:hAnsi="Times New Roman" w:cs="Times New Roman"/>
+          <w:sz w:val="24"/>
+          <w:szCs w:val="24"/>
+        </w:rPr>
+        <w:lastRenderedPageBreak/>
+        <w:t>Below are the</w:t>
+      </w:r>
+      <w:r>
+        <w:rPr>
+          <w:rFonts w:ascii="Times New Roman" w:hAnsi="Times New Roman" w:cs="Times New Roman"/>
+          <w:sz w:val="24"/>
+          <w:szCs w:val="24"/>
+        </w:rPr>
+        <w:t xml:space="preserve"> screenshot</w:t>
+      </w:r>
+      <w:r>
+        <w:rPr>
+          <w:rFonts w:ascii="Times New Roman" w:hAnsi="Times New Roman" w:cs="Times New Roman"/>
+          <w:sz w:val="24"/>
+          <w:szCs w:val="24"/>
+        </w:rPr>
+        <w:t>s</w:t>
+      </w:r>
+      <w:r>
+        <w:rPr>
+          <w:rFonts w:ascii="Times New Roman" w:hAnsi="Times New Roman" w:cs="Times New Roman"/>
+          <w:sz w:val="24"/>
+          <w:szCs w:val="24"/>
+        </w:rPr>
+        <w:t xml:space="preserve"> of the </w:t>
       </w:r>
       <w:proofErr w:type="spellStart"/>
       <w:r>
         <w:rPr>
+          <w:rFonts w:ascii="Times New Roman" w:hAnsi="Times New Roman" w:cs="Times New Roman"/>
           <w:sz w:val="24"/>
           <w:szCs w:val="24"/>
         </w:rPr>
@@ -817,6 +901,7 @@
       <w:proofErr w:type="spellEnd"/>
       <w:r>
         <w:rPr>
+          <w:rFonts w:ascii="Times New Roman" w:hAnsi="Times New Roman" w:cs="Times New Roman"/>
           <w:sz w:val="24"/>
           <w:szCs w:val="24"/>
         </w:rPr>
@@ -825,6 +910,7 @@
       <w:proofErr w:type="spellStart"/>
       <w:r>
         <w:rPr>
+          <w:rFonts w:ascii="Times New Roman" w:hAnsi="Times New Roman" w:cs="Times New Roman"/>
           <w:sz w:val="24"/>
           <w:szCs w:val="24"/>
         </w:rPr>
@@ -833,6 +919,7 @@
       <w:proofErr w:type="spellEnd"/>
       <w:r>
         <w:rPr>
+          <w:rFonts w:ascii="Times New Roman" w:hAnsi="Times New Roman" w:cs="Times New Roman"/>
           <w:sz w:val="24"/>
           <w:szCs w:val="24"/>
         </w:rPr>
@@ -841,6 +928,7 @@
       <w:proofErr w:type="spellStart"/>
       <w:r>
         <w:rPr>
+          <w:rFonts w:ascii="Times New Roman" w:hAnsi="Times New Roman" w:cs="Times New Roman"/>
           <w:sz w:val="24"/>
           <w:szCs w:val="24"/>
         </w:rPr>
@@ -849,6 +937,7 @@
       <w:proofErr w:type="spellEnd"/>
       <w:r>
         <w:rPr>
+          <w:rFonts w:ascii="Times New Roman" w:hAnsi="Times New Roman" w:cs="Times New Roman"/>
           <w:sz w:val="24"/>
           <w:szCs w:val="24"/>
         </w:rPr>
@@ -857,6 +946,7 @@
       <w:proofErr w:type="spellStart"/>
       <w:r>
         <w:rPr>
+          <w:rFonts w:ascii="Times New Roman" w:hAnsi="Times New Roman" w:cs="Times New Roman"/>
           <w:sz w:val="24"/>
           <w:szCs w:val="24"/>
         </w:rPr>
@@ -865,6 +955,7 @@
       <w:proofErr w:type="spellEnd"/>
       <w:r>
         <w:rPr>
+          <w:rFonts w:ascii="Times New Roman" w:hAnsi="Times New Roman" w:cs="Times New Roman"/>
           <w:sz w:val="24"/>
           <w:szCs w:val="24"/>
         </w:rPr>
@@ -874,12 +965,23 @@
     <w:p>
       <w:pPr>
         <w:rPr>
-          <w:sz w:val="24"/>
-          <w:szCs w:val="24"/>
-        </w:rPr>
-      </w:pPr>
-      <w:r>
-        <w:rPr>
+          <w:rFonts w:ascii="Times New Roman" w:hAnsi="Times New Roman" w:cs="Times New Roman"/>
+          <w:sz w:val="24"/>
+          <w:szCs w:val="24"/>
+        </w:rPr>
+      </w:pPr>
+    </w:p>
+    <w:p>
+      <w:pPr>
+        <w:rPr>
+          <w:rFonts w:ascii="Times New Roman" w:hAnsi="Times New Roman" w:cs="Times New Roman"/>
+          <w:sz w:val="24"/>
+          <w:szCs w:val="24"/>
+        </w:rPr>
+      </w:pPr>
+      <w:r>
+        <w:rPr>
+          <w:rFonts w:ascii="Times New Roman" w:hAnsi="Times New Roman" w:cs="Times New Roman"/>
           <w:sz w:val="24"/>
           <w:szCs w:val="24"/>
         </w:rPr>
@@ -899,7 +1001,7 @@
                     <pic:cNvPicPr/>
                   </pic:nvPicPr>
                   <pic:blipFill>
-                    <a:blip r:embed="rId9"/>
+                    <a:blip r:embed="rId10"/>
                     <a:stretch>
                       <a:fillRect/>
                     </a:stretch>
@@ -923,12 +1025,14 @@
     <w:p>
       <w:pPr>
         <w:rPr>
-          <w:sz w:val="24"/>
-          <w:szCs w:val="24"/>
-        </w:rPr>
-      </w:pPr>
-      <w:r>
-        <w:rPr>
+          <w:rFonts w:ascii="Times New Roman" w:hAnsi="Times New Roman" w:cs="Times New Roman"/>
+          <w:sz w:val="24"/>
+          <w:szCs w:val="24"/>
+        </w:rPr>
+      </w:pPr>
+      <w:r>
+        <w:rPr>
+          <w:rFonts w:ascii="Times New Roman" w:hAnsi="Times New Roman" w:cs="Times New Roman"/>
           <w:sz w:val="24"/>
           <w:szCs w:val="24"/>
         </w:rPr>
@@ -948,7 +1052,7 @@
                     <pic:cNvPicPr/>
                   </pic:nvPicPr>
                   <pic:blipFill>
-                    <a:blip r:embed="rId10"/>
+                    <a:blip r:embed="rId11"/>
                     <a:stretch>
                       <a:fillRect/>
                     </a:stretch>
@@ -972,111 +1076,158 @@
     <w:p>
       <w:pPr>
         <w:rPr>
-          <w:sz w:val="24"/>
-          <w:szCs w:val="24"/>
-        </w:rPr>
-      </w:pPr>
-      <w:r>
-        <w:rPr>
+          <w:rFonts w:ascii="Times New Roman" w:hAnsi="Times New Roman" w:cs="Times New Roman"/>
+          <w:sz w:val="24"/>
+          <w:szCs w:val="24"/>
+        </w:rPr>
+      </w:pPr>
+    </w:p>
+    <w:p>
+      <w:pPr>
+        <w:rPr>
+          <w:rFonts w:ascii="Times New Roman" w:hAnsi="Times New Roman" w:cs="Times New Roman"/>
+          <w:sz w:val="24"/>
+          <w:szCs w:val="24"/>
+        </w:rPr>
+      </w:pPr>
+      <w:r>
+        <w:rPr>
+          <w:rFonts w:ascii="Times New Roman" w:hAnsi="Times New Roman" w:cs="Times New Roman"/>
+          <w:sz w:val="24"/>
+          <w:szCs w:val="24"/>
+        </w:rPr>
+        <w:t xml:space="preserve">Below are the </w:t>
+      </w:r>
+      <w:r>
+        <w:rPr>
+          <w:rFonts w:ascii="Times New Roman" w:hAnsi="Times New Roman" w:cs="Times New Roman"/>
+          <w:sz w:val="24"/>
+          <w:szCs w:val="24"/>
+        </w:rPr>
+        <w:t>screenshot</w:t>
+      </w:r>
+      <w:r>
+        <w:rPr>
+          <w:rFonts w:ascii="Times New Roman" w:hAnsi="Times New Roman" w:cs="Times New Roman"/>
+          <w:sz w:val="24"/>
+          <w:szCs w:val="24"/>
+        </w:rPr>
+        <w:t>s</w:t>
+      </w:r>
+      <w:r>
+        <w:rPr>
+          <w:rFonts w:ascii="Times New Roman" w:hAnsi="Times New Roman" w:cs="Times New Roman"/>
+          <w:sz w:val="24"/>
+          <w:szCs w:val="24"/>
+        </w:rPr>
+        <w:t xml:space="preserve"> of the </w:t>
+      </w:r>
+      <w:proofErr w:type="spellStart"/>
+      <w:r>
+        <w:rPr>
+          <w:rFonts w:ascii="Times New Roman" w:hAnsi="Times New Roman" w:cs="Times New Roman"/>
+          <w:sz w:val="24"/>
+          <w:szCs w:val="24"/>
+        </w:rPr>
+        <w:t>ResetBoard</w:t>
+      </w:r>
+      <w:proofErr w:type="spellEnd"/>
+      <w:r>
+        <w:rPr>
+          <w:rFonts w:ascii="Times New Roman" w:hAnsi="Times New Roman" w:cs="Times New Roman"/>
+          <w:sz w:val="24"/>
+          <w:szCs w:val="24"/>
+        </w:rPr>
+        <w:t xml:space="preserve">, </w:t>
+      </w:r>
+      <w:proofErr w:type="spellStart"/>
+      <w:r>
+        <w:rPr>
+          <w:rFonts w:ascii="Times New Roman" w:hAnsi="Times New Roman" w:cs="Times New Roman"/>
+          <w:sz w:val="24"/>
+          <w:szCs w:val="24"/>
+        </w:rPr>
+        <w:t>IsOnBoard</w:t>
+      </w:r>
+      <w:proofErr w:type="spellEnd"/>
+      <w:r>
+        <w:rPr>
+          <w:rFonts w:ascii="Times New Roman" w:hAnsi="Times New Roman" w:cs="Times New Roman"/>
+          <w:sz w:val="24"/>
+          <w:szCs w:val="24"/>
+        </w:rPr>
+        <w:t xml:space="preserve">, </w:t>
+      </w:r>
+      <w:proofErr w:type="spellStart"/>
+      <w:r>
+        <w:rPr>
+          <w:rFonts w:ascii="Times New Roman" w:hAnsi="Times New Roman" w:cs="Times New Roman"/>
+          <w:sz w:val="24"/>
+          <w:szCs w:val="24"/>
+        </w:rPr>
+        <w:t>MarkLegalMoves</w:t>
+      </w:r>
+      <w:proofErr w:type="spellEnd"/>
+      <w:r>
+        <w:rPr>
+          <w:rFonts w:ascii="Times New Roman" w:hAnsi="Times New Roman" w:cs="Times New Roman"/>
+          <w:sz w:val="24"/>
+          <w:szCs w:val="24"/>
+        </w:rPr>
+        <w:t xml:space="preserve">, and </w:t>
+      </w:r>
+      <w:proofErr w:type="spellStart"/>
+      <w:r>
+        <w:rPr>
+          <w:rFonts w:ascii="Times New Roman" w:hAnsi="Times New Roman" w:cs="Times New Roman"/>
+          <w:sz w:val="24"/>
+          <w:szCs w:val="24"/>
+        </w:rPr>
+        <w:t>MarkValidKnightMoves</w:t>
+      </w:r>
+      <w:proofErr w:type="spellEnd"/>
+      <w:r>
+        <w:rPr>
+          <w:rFonts w:ascii="Times New Roman" w:hAnsi="Times New Roman" w:cs="Times New Roman"/>
+          <w:sz w:val="24"/>
+          <w:szCs w:val="24"/>
+        </w:rPr>
+        <w:t xml:space="preserve"> methods in </w:t>
+      </w:r>
+      <w:proofErr w:type="spellStart"/>
+      <w:r>
+        <w:rPr>
+          <w:rFonts w:ascii="Times New Roman" w:hAnsi="Times New Roman" w:cs="Times New Roman"/>
+          <w:sz w:val="24"/>
+          <w:szCs w:val="24"/>
+        </w:rPr>
+        <w:t>BoardLogic</w:t>
+      </w:r>
+      <w:proofErr w:type="spellEnd"/>
+      <w:r>
+        <w:rPr>
+          <w:rFonts w:ascii="Times New Roman" w:hAnsi="Times New Roman" w:cs="Times New Roman"/>
+          <w:sz w:val="24"/>
+          <w:szCs w:val="24"/>
+        </w:rPr>
+        <w:t>.</w:t>
+      </w:r>
+    </w:p>
+    <w:p>
+      <w:pPr>
+        <w:rPr>
+          <w:rFonts w:ascii="Times New Roman" w:hAnsi="Times New Roman" w:cs="Times New Roman"/>
+          <w:sz w:val="24"/>
+          <w:szCs w:val="24"/>
+        </w:rPr>
+      </w:pPr>
+      <w:r>
+        <w:rPr>
+          <w:rFonts w:ascii="Times New Roman" w:hAnsi="Times New Roman" w:cs="Times New Roman"/>
           <w:sz w:val="24"/>
           <w:szCs w:val="24"/>
         </w:rPr>
         <w:lastRenderedPageBreak/>
-        <w:t xml:space="preserve">·Take a screenshot of the </w:t>
-      </w:r>
-      <w:proofErr w:type="spellStart"/>
-      <w:r>
-        <w:rPr>
-          <w:sz w:val="24"/>
-          <w:szCs w:val="24"/>
-        </w:rPr>
-        <w:t>ResetBoard</w:t>
-      </w:r>
-      <w:proofErr w:type="spellEnd"/>
-      <w:r>
-        <w:rPr>
-          <w:sz w:val="24"/>
-          <w:szCs w:val="24"/>
-        </w:rPr>
-        <w:t xml:space="preserve">, </w:t>
-      </w:r>
-      <w:proofErr w:type="spellStart"/>
-      <w:r>
-        <w:rPr>
-          <w:sz w:val="24"/>
-          <w:szCs w:val="24"/>
-        </w:rPr>
-        <w:t>IsOnBoard</w:t>
-      </w:r>
-      <w:proofErr w:type="spellEnd"/>
-      <w:r>
-        <w:rPr>
-          <w:sz w:val="24"/>
-          <w:szCs w:val="24"/>
-        </w:rPr>
-        <w:t xml:space="preserve">, </w:t>
-      </w:r>
-      <w:proofErr w:type="spellStart"/>
-      <w:r>
-        <w:rPr>
-          <w:sz w:val="24"/>
-          <w:szCs w:val="24"/>
-        </w:rPr>
-        <w:t>MarkLegalMoves</w:t>
-      </w:r>
-      <w:proofErr w:type="spellEnd"/>
-      <w:r>
-        <w:rPr>
-          <w:sz w:val="24"/>
-          <w:szCs w:val="24"/>
-        </w:rPr>
-        <w:t xml:space="preserve">, and </w:t>
-      </w:r>
-      <w:proofErr w:type="spellStart"/>
-      <w:r>
-        <w:rPr>
-          <w:sz w:val="24"/>
-          <w:szCs w:val="24"/>
-        </w:rPr>
-        <w:t>MarkValidKnightMoves</w:t>
-      </w:r>
-      <w:proofErr w:type="spellEnd"/>
-      <w:r>
-        <w:rPr>
-          <w:sz w:val="24"/>
-          <w:szCs w:val="24"/>
-        </w:rPr>
-        <w:t xml:space="preserve"> methods in </w:t>
-      </w:r>
-      <w:proofErr w:type="spellStart"/>
-      <w:r>
-        <w:rPr>
-          <w:sz w:val="24"/>
-          <w:szCs w:val="24"/>
-        </w:rPr>
-        <w:t>BoardLogic</w:t>
-      </w:r>
-      <w:proofErr w:type="spellEnd"/>
-      <w:r>
-        <w:rPr>
-          <w:sz w:val="24"/>
-          <w:szCs w:val="24"/>
-        </w:rPr>
-        <w:t>.</w:t>
-      </w:r>
-    </w:p>
-    <w:p>
-      <w:pPr>
-        <w:rPr>
-          <w:sz w:val="24"/>
-          <w:szCs w:val="24"/>
-        </w:rPr>
-      </w:pPr>
-      <w:r>
-        <w:rPr>
-          <w:sz w:val="24"/>
-          <w:szCs w:val="24"/>
-        </w:rPr>
         <w:drawing>
           <wp:inline distT="0" distB="0" distL="0" distR="0" wp14:anchorId="3BAD0BE2" wp14:editId="78ADAAF3">
             <wp:extent cx="3162741" cy="3086531"/>
@@ -1093,7 +1244,7 @@
                     <pic:cNvPicPr/>
                   </pic:nvPicPr>
                   <pic:blipFill>
-                    <a:blip r:embed="rId11"/>
+                    <a:blip r:embed="rId12"/>
                     <a:stretch>
                       <a:fillRect/>
                     </a:stretch>
@@ -1117,20 +1268,23 @@
     <w:p>
       <w:pPr>
         <w:rPr>
-          <w:sz w:val="24"/>
-          <w:szCs w:val="24"/>
-        </w:rPr>
-      </w:pPr>
-    </w:p>
-    <w:p>
-      <w:pPr>
-        <w:rPr>
-          <w:sz w:val="24"/>
-          <w:szCs w:val="24"/>
-        </w:rPr>
-      </w:pPr>
-      <w:r>
-        <w:rPr>
+          <w:rFonts w:ascii="Times New Roman" w:hAnsi="Times New Roman" w:cs="Times New Roman"/>
+          <w:sz w:val="24"/>
+          <w:szCs w:val="24"/>
+        </w:rPr>
+      </w:pPr>
+    </w:p>
+    <w:p>
+      <w:pPr>
+        <w:rPr>
+          <w:rFonts w:ascii="Times New Roman" w:hAnsi="Times New Roman" w:cs="Times New Roman"/>
+          <w:sz w:val="24"/>
+          <w:szCs w:val="24"/>
+        </w:rPr>
+      </w:pPr>
+      <w:r>
+        <w:rPr>
+          <w:rFonts w:ascii="Times New Roman" w:hAnsi="Times New Roman" w:cs="Times New Roman"/>
           <w:sz w:val="24"/>
           <w:szCs w:val="24"/>
         </w:rPr>
@@ -1150,7 +1304,7 @@
                     <pic:cNvPicPr/>
                   </pic:nvPicPr>
                   <pic:blipFill>
-                    <a:blip r:embed="rId12"/>
+                    <a:blip r:embed="rId13"/>
                     <a:stretch>
                       <a:fillRect/>
                     </a:stretch>
@@ -1174,20 +1328,22 @@
     <w:p>
       <w:pPr>
         <w:rPr>
-          <w:sz w:val="24"/>
-          <w:szCs w:val="24"/>
-        </w:rPr>
-      </w:pPr>
-      <w:r>
-        <w:rPr>
+          <w:rFonts w:ascii="Times New Roman" w:hAnsi="Times New Roman" w:cs="Times New Roman"/>
+          <w:sz w:val="24"/>
+          <w:szCs w:val="24"/>
+        </w:rPr>
+      </w:pPr>
+      <w:r>
+        <w:rPr>
+          <w:rFonts w:ascii="Times New Roman" w:hAnsi="Times New Roman" w:cs="Times New Roman"/>
           <w:sz w:val="24"/>
           <w:szCs w:val="24"/>
         </w:rPr>
         <w:lastRenderedPageBreak/>
         <w:drawing>
-          <wp:inline distT="0" distB="0" distL="0" distR="0" wp14:anchorId="69F185A8" wp14:editId="71A171B8">
-            <wp:extent cx="4353533" cy="3658111"/>
-            <wp:effectExtent l="0" t="0" r="9525" b="0"/>
+          <wp:inline distT="0" distB="0" distL="0" distR="0" wp14:anchorId="69F185A8" wp14:editId="6F5C3FB7">
+            <wp:extent cx="3505200" cy="2945288"/>
+            <wp:effectExtent l="0" t="0" r="0" b="7620"/>
             <wp:docPr id="597663238" name="Picture 1"/>
             <wp:cNvGraphicFramePr>
               <a:graphicFrameLocks xmlns:a="http://schemas.openxmlformats.org/drawingml/2006/main" noChangeAspect="1"/>
@@ -1200,7 +1356,7 @@
                     <pic:cNvPicPr/>
                   </pic:nvPicPr>
                   <pic:blipFill>
-                    <a:blip r:embed="rId13"/>
+                    <a:blip r:embed="rId14"/>
                     <a:stretch>
                       <a:fillRect/>
                     </a:stretch>
@@ -1208,7 +1364,7 @@
                   <pic:spPr>
                     <a:xfrm>
                       <a:off x="0" y="0"/>
-                      <a:ext cx="4353533" cy="3658111"/>
+                      <a:ext cx="3515344" cy="2953811"/>
                     </a:xfrm>
                     <a:prstGeom prst="rect">
                       <a:avLst/>
@@ -1224,65 +1380,11 @@
     <w:p>
       <w:pPr>
         <w:rPr>
-          <w:sz w:val="24"/>
-          <w:szCs w:val="24"/>
-        </w:rPr>
-      </w:pPr>
-      <w:r>
-        <w:rPr>
-          <w:sz w:val="24"/>
-          <w:szCs w:val="24"/>
-        </w:rPr>
-        <w:t xml:space="preserve">Take a screenshot of the UML for the </w:t>
-      </w:r>
-      <w:proofErr w:type="spellStart"/>
-      <w:r>
-        <w:rPr>
-          <w:sz w:val="24"/>
-          <w:szCs w:val="24"/>
-        </w:rPr>
-        <w:t>CellModel</w:t>
-      </w:r>
-      <w:proofErr w:type="spellEnd"/>
-      <w:r>
-        <w:rPr>
-          <w:sz w:val="24"/>
-          <w:szCs w:val="24"/>
-        </w:rPr>
-        <w:t xml:space="preserve">, </w:t>
-      </w:r>
-      <w:proofErr w:type="spellStart"/>
-      <w:r>
-        <w:rPr>
-          <w:sz w:val="24"/>
-          <w:szCs w:val="24"/>
-        </w:rPr>
-        <w:t>BoardModel</w:t>
-      </w:r>
-      <w:proofErr w:type="spellEnd"/>
-      <w:r>
-        <w:rPr>
-          <w:sz w:val="24"/>
-          <w:szCs w:val="24"/>
-        </w:rPr>
-        <w:t xml:space="preserve">, and </w:t>
-      </w:r>
-      <w:proofErr w:type="spellStart"/>
-      <w:r>
-        <w:rPr>
-          <w:sz w:val="24"/>
-          <w:szCs w:val="24"/>
-        </w:rPr>
-        <w:t>BoardLogic</w:t>
-      </w:r>
-      <w:proofErr w:type="spellEnd"/>
-      <w:r>
-        <w:rPr>
-          <w:sz w:val="24"/>
-          <w:szCs w:val="24"/>
-        </w:rPr>
-        <w:t xml:space="preserve"> classes.</w:t>
-      </w:r>
+          <w:rFonts w:ascii="Times New Roman" w:hAnsi="Times New Roman" w:cs="Times New Roman"/>
+          <w:sz w:val="24"/>
+          <w:szCs w:val="24"/>
+        </w:rPr>
+      </w:pPr>
     </w:p>
     <w:p>
       <w:pPr>
@@ -1302,7 +1404,24 @@
           <w:szCs w:val="24"/>
         </w:rPr>
         <w:br/>
-        <w:t>Adding the following features:</w:t>
+      </w:r>
+      <w:r>
+        <w:rPr>
+          <w:rFonts w:ascii="Times New Roman" w:eastAsia="Calibri" w:hAnsi="Times New Roman" w:cs="Times New Roman"/>
+          <w:bCs/>
+          <w:sz w:val="24"/>
+          <w:szCs w:val="24"/>
+        </w:rPr>
+        <w:t>After a</w:t>
+      </w:r>
+      <w:r>
+        <w:rPr>
+          <w:rFonts w:ascii="Times New Roman" w:eastAsia="Calibri" w:hAnsi="Times New Roman" w:cs="Times New Roman"/>
+          <w:bCs/>
+          <w:sz w:val="24"/>
+          <w:szCs w:val="24"/>
+        </w:rPr>
+        <w:t>dding the following features:</w:t>
       </w:r>
     </w:p>
     <w:p>
@@ -1409,19 +1528,8 @@
           <w:sz w:val="24"/>
           <w:szCs w:val="24"/>
         </w:rPr>
-        <w:t>Finish the king case for in switch statement in its own method. The king can move one square in any direction on the board as shown in Figure 26.</w:t>
-      </w:r>
-    </w:p>
-    <w:p>
-      <w:pPr>
-        <w:pStyle w:val="PlainText"/>
-        <w:rPr>
-          <w:rFonts w:ascii="Times New Roman" w:eastAsia="Calibri" w:hAnsi="Times New Roman" w:cs="Times New Roman"/>
-          <w:bCs/>
-          <w:sz w:val="24"/>
-          <w:szCs w:val="24"/>
-        </w:rPr>
-      </w:pPr>
+        <w:t xml:space="preserve">Finish the king case for in switch statement in its own method. </w:t>
+      </w:r>
     </w:p>
     <w:p>
       <w:pPr>
@@ -1445,29 +1553,48 @@
           <w:szCs w:val="24"/>
         </w:rPr>
       </w:pPr>
-    </w:p>
-    <w:p>
-      <w:pPr>
-        <w:pStyle w:val="PlainText"/>
-        <w:rPr>
-          <w:rFonts w:ascii="Times New Roman" w:eastAsia="Calibri" w:hAnsi="Times New Roman" w:cs="Times New Roman"/>
-          <w:bCs/>
-          <w:sz w:val="24"/>
-          <w:szCs w:val="24"/>
-        </w:rPr>
-      </w:pPr>
-      <w:r>
-        <w:rPr>
-          <w:rFonts w:ascii="Times New Roman" w:eastAsia="Calibri" w:hAnsi="Times New Roman" w:cs="Times New Roman"/>
-          <w:bCs/>
-          <w:sz w:val="24"/>
-          <w:szCs w:val="24"/>
-        </w:rPr>
-        <w:lastRenderedPageBreak/>
+      <w:r>
+        <w:rPr>
+          <w:rFonts w:ascii="Times New Roman" w:eastAsia="Calibri" w:hAnsi="Times New Roman" w:cs="Times New Roman"/>
+          <w:bCs/>
+          <w:sz w:val="24"/>
+          <w:szCs w:val="24"/>
+        </w:rPr>
+        <w:t>Below are the codes:</w:t>
+      </w:r>
+    </w:p>
+    <w:p>
+      <w:pPr>
+        <w:pStyle w:val="PlainText"/>
+        <w:rPr>
+          <w:rFonts w:ascii="Times New Roman" w:eastAsia="Calibri" w:hAnsi="Times New Roman" w:cs="Times New Roman"/>
+          <w:bCs/>
+          <w:sz w:val="24"/>
+          <w:szCs w:val="24"/>
+        </w:rPr>
+      </w:pPr>
+    </w:p>
+    <w:p>
+      <w:pPr>
+        <w:pStyle w:val="PlainText"/>
+        <w:rPr>
+          <w:rFonts w:ascii="Times New Roman" w:eastAsia="Calibri" w:hAnsi="Times New Roman" w:cs="Times New Roman"/>
+          <w:bCs/>
+          <w:sz w:val="24"/>
+          <w:szCs w:val="24"/>
+        </w:rPr>
+      </w:pPr>
+      <w:r>
+        <w:rPr>
+          <w:rFonts w:ascii="Times New Roman" w:eastAsia="Calibri" w:hAnsi="Times New Roman" w:cs="Times New Roman"/>
+          <w:bCs/>
+          <w:sz w:val="24"/>
+          <w:szCs w:val="24"/>
+        </w:rPr>
         <w:drawing>
-          <wp:inline distT="0" distB="0" distL="0" distR="0" wp14:anchorId="0C946C43" wp14:editId="350A00B6">
-            <wp:extent cx="4677428" cy="3772426"/>
-            <wp:effectExtent l="0" t="0" r="8890" b="0"/>
+          <wp:inline distT="0" distB="0" distL="0" distR="0" wp14:anchorId="0C946C43" wp14:editId="2BAF3EFE">
+            <wp:extent cx="3721100" cy="3001131"/>
+            <wp:effectExtent l="0" t="0" r="0" b="8890"/>
             <wp:docPr id="1190416310" name="Picture 1"/>
             <wp:cNvGraphicFramePr>
               <a:graphicFrameLocks xmlns:a="http://schemas.openxmlformats.org/drawingml/2006/main" noChangeAspect="1"/>
@@ -1480,7 +1607,7 @@
                     <pic:cNvPicPr/>
                   </pic:nvPicPr>
                   <pic:blipFill>
-                    <a:blip r:embed="rId14"/>
+                    <a:blip r:embed="rId15"/>
                     <a:stretch>
                       <a:fillRect/>
                     </a:stretch>
@@ -1488,7 +1615,7 @@
                   <pic:spPr>
                     <a:xfrm>
                       <a:off x="0" y="0"/>
-                      <a:ext cx="4677428" cy="3772426"/>
+                      <a:ext cx="3729558" cy="3007952"/>
                     </a:xfrm>
                     <a:prstGeom prst="rect">
                       <a:avLst/>
@@ -1529,7 +1656,6 @@
           <w:sz w:val="24"/>
           <w:szCs w:val="24"/>
         </w:rPr>
-        <w:lastRenderedPageBreak/>
         <w:drawing>
           <wp:inline distT="0" distB="0" distL="0" distR="0" wp14:anchorId="6768211F" wp14:editId="20CB9AC0">
             <wp:extent cx="4496427" cy="4505954"/>
@@ -1546,7 +1672,7 @@
                     <pic:cNvPicPr/>
                   </pic:nvPicPr>
                   <pic:blipFill>
-                    <a:blip r:embed="rId15"/>
+                    <a:blip r:embed="rId16"/>
                     <a:stretch>
                       <a:fillRect/>
                     </a:stretch>
@@ -1611,7 +1737,7 @@
                     <pic:cNvPicPr/>
                   </pic:nvPicPr>
                   <pic:blipFill>
-                    <a:blip r:embed="rId16"/>
+                    <a:blip r:embed="rId17"/>
                     <a:stretch>
                       <a:fillRect/>
                     </a:stretch>
@@ -1653,13 +1779,25 @@
           <w:szCs w:val="24"/>
         </w:rPr>
       </w:pPr>
-      <w:r>
-        <w:rPr>
-          <w:rFonts w:ascii="Times New Roman" w:eastAsia="Calibri" w:hAnsi="Times New Roman" w:cs="Times New Roman"/>
-          <w:bCs/>
-          <w:sz w:val="24"/>
-          <w:szCs w:val="24"/>
-        </w:rPr>
+    </w:p>
+    <w:p>
+      <w:pPr>
+        <w:pStyle w:val="PlainText"/>
+        <w:rPr>
+          <w:rFonts w:ascii="Times New Roman" w:eastAsia="Calibri" w:hAnsi="Times New Roman" w:cs="Times New Roman"/>
+          <w:b/>
+          <w:sz w:val="24"/>
+          <w:szCs w:val="24"/>
+        </w:rPr>
+      </w:pPr>
+      <w:r>
+        <w:rPr>
+          <w:rFonts w:ascii="Times New Roman" w:eastAsia="Calibri" w:hAnsi="Times New Roman" w:cs="Times New Roman"/>
+          <w:b/>
+          <w:sz w:val="24"/>
+          <w:szCs w:val="24"/>
+        </w:rPr>
+        <w:lastRenderedPageBreak/>
         <w:t>Part 2:</w:t>
       </w:r>
     </w:p>
@@ -1691,9 +1829,19 @@
           <w:sz w:val="24"/>
           <w:szCs w:val="24"/>
         </w:rPr>
-        <w:lastRenderedPageBreak/>
         <w:t>The application being run</w:t>
       </w:r>
+    </w:p>
+    <w:p>
+      <w:pPr>
+        <w:pStyle w:val="PlainText"/>
+        <w:rPr>
+          <w:rFonts w:ascii="Times New Roman" w:eastAsia="Calibri" w:hAnsi="Times New Roman" w:cs="Times New Roman"/>
+          <w:bCs/>
+          <w:sz w:val="24"/>
+          <w:szCs w:val="24"/>
+        </w:rPr>
+      </w:pPr>
     </w:p>
     <w:p>
       <w:pPr>
@@ -1728,7 +1876,7 @@
                     <pic:cNvPicPr/>
                   </pic:nvPicPr>
                   <pic:blipFill>
-                    <a:blip r:embed="rId17"/>
+                    <a:blip r:embed="rId18"/>
                     <a:stretch>
                       <a:fillRect/>
                     </a:stretch>
@@ -1777,7 +1925,16 @@
           <w:sz w:val="24"/>
           <w:szCs w:val="24"/>
         </w:rPr>
-        <w:t>Take a screenshot of the application running at this point with a queen placed at 1, 1.</w:t>
+        <w:t>A</w:t>
+      </w:r>
+      <w:r>
+        <w:rPr>
+          <w:rFonts w:ascii="Times New Roman" w:eastAsia="Calibri" w:hAnsi="Times New Roman" w:cs="Times New Roman"/>
+          <w:bCs/>
+          <w:sz w:val="24"/>
+          <w:szCs w:val="24"/>
+        </w:rPr>
+        <w:t xml:space="preserve"> screenshot of the application running at this point with a queen placed at 1, 1.</w:t>
       </w:r>
     </w:p>
     <w:p>
@@ -1824,7 +1981,7 @@
                     <pic:cNvPicPr/>
                   </pic:nvPicPr>
                   <pic:blipFill>
-                    <a:blip r:embed="rId18"/>
+                    <a:blip r:embed="rId19"/>
                     <a:stretch>
                       <a:fillRect/>
                     </a:stretch>
@@ -1866,14 +2023,68 @@
           <w:szCs w:val="24"/>
         </w:rPr>
       </w:pPr>
-      <w:r>
-        <w:rPr>
-          <w:rFonts w:ascii="Times New Roman" w:eastAsia="Calibri" w:hAnsi="Times New Roman" w:cs="Times New Roman"/>
-          <w:bCs/>
-          <w:sz w:val="24"/>
-          <w:szCs w:val="24"/>
-        </w:rPr>
-        <w:t xml:space="preserve">·Take a screenshot of the citations for </w:t>
+    </w:p>
+    <w:p>
+      <w:pPr>
+        <w:pStyle w:val="PlainText"/>
+        <w:rPr>
+          <w:rFonts w:ascii="Times New Roman" w:eastAsia="Calibri" w:hAnsi="Times New Roman" w:cs="Times New Roman"/>
+          <w:bCs/>
+          <w:sz w:val="24"/>
+          <w:szCs w:val="24"/>
+        </w:rPr>
+      </w:pPr>
+    </w:p>
+    <w:p>
+      <w:pPr>
+        <w:pStyle w:val="PlainText"/>
+        <w:rPr>
+          <w:rFonts w:ascii="Times New Roman" w:eastAsia="Calibri" w:hAnsi="Times New Roman" w:cs="Times New Roman"/>
+          <w:bCs/>
+          <w:sz w:val="24"/>
+          <w:szCs w:val="24"/>
+        </w:rPr>
+      </w:pPr>
+    </w:p>
+    <w:p>
+      <w:pPr>
+        <w:pStyle w:val="PlainText"/>
+        <w:rPr>
+          <w:rFonts w:ascii="Times New Roman" w:eastAsia="Calibri" w:hAnsi="Times New Roman" w:cs="Times New Roman"/>
+          <w:bCs/>
+          <w:sz w:val="24"/>
+          <w:szCs w:val="24"/>
+        </w:rPr>
+      </w:pPr>
+    </w:p>
+    <w:p>
+      <w:pPr>
+        <w:pStyle w:val="PlainText"/>
+        <w:rPr>
+          <w:rFonts w:ascii="Times New Roman" w:eastAsia="Calibri" w:hAnsi="Times New Roman" w:cs="Times New Roman"/>
+          <w:bCs/>
+          <w:sz w:val="24"/>
+          <w:szCs w:val="24"/>
+        </w:rPr>
+      </w:pPr>
+      <w:r>
+        <w:rPr>
+          <w:rFonts w:ascii="Times New Roman" w:eastAsia="Calibri" w:hAnsi="Times New Roman" w:cs="Times New Roman"/>
+          <w:bCs/>
+          <w:sz w:val="24"/>
+          <w:szCs w:val="24"/>
+        </w:rPr>
+        <w:lastRenderedPageBreak/>
+        <w:t>A</w:t>
+      </w:r>
+      <w:r>
+        <w:rPr>
+          <w:rFonts w:ascii="Times New Roman" w:eastAsia="Calibri" w:hAnsi="Times New Roman" w:cs="Times New Roman"/>
+          <w:bCs/>
+          <w:sz w:val="24"/>
+          <w:szCs w:val="24"/>
+        </w:rPr>
+        <w:t xml:space="preserve"> screenshot of the citations for </w:t>
       </w:r>
       <w:proofErr w:type="spellStart"/>
       <w:r>
@@ -1906,14 +2117,24 @@
           <w:szCs w:val="24"/>
         </w:rPr>
       </w:pPr>
-      <w:r>
-        <w:rPr>
-          <w:rFonts w:ascii="Times New Roman" w:eastAsia="Calibri" w:hAnsi="Times New Roman" w:cs="Times New Roman"/>
-          <w:bCs/>
-          <w:sz w:val="24"/>
-          <w:szCs w:val="24"/>
-        </w:rPr>
-        <w:lastRenderedPageBreak/>
+    </w:p>
+    <w:p>
+      <w:pPr>
+        <w:pStyle w:val="PlainText"/>
+        <w:rPr>
+          <w:rFonts w:ascii="Times New Roman" w:eastAsia="Calibri" w:hAnsi="Times New Roman" w:cs="Times New Roman"/>
+          <w:bCs/>
+          <w:sz w:val="24"/>
+          <w:szCs w:val="24"/>
+        </w:rPr>
+      </w:pPr>
+      <w:r>
+        <w:rPr>
+          <w:rFonts w:ascii="Times New Roman" w:eastAsia="Calibri" w:hAnsi="Times New Roman" w:cs="Times New Roman"/>
+          <w:bCs/>
+          <w:sz w:val="24"/>
+          <w:szCs w:val="24"/>
+        </w:rPr>
         <w:drawing>
           <wp:inline distT="0" distB="0" distL="0" distR="0" wp14:anchorId="43A31668" wp14:editId="629F6620">
             <wp:extent cx="3019846" cy="1829055"/>
@@ -1930,7 +2151,7 @@
                     <pic:cNvPicPr/>
                   </pic:nvPicPr>
                   <pic:blipFill>
-                    <a:blip r:embed="rId19"/>
+                    <a:blip r:embed="rId20"/>
                     <a:stretch>
                       <a:fillRect/>
                     </a:stretch>
@@ -1979,7 +2200,16 @@
           <w:sz w:val="24"/>
           <w:szCs w:val="24"/>
         </w:rPr>
-        <w:t xml:space="preserve">·Take a screenshot of the </w:t>
+        <w:t>A</w:t>
+      </w:r>
+      <w:r>
+        <w:rPr>
+          <w:rFonts w:ascii="Times New Roman" w:eastAsia="Calibri" w:hAnsi="Times New Roman" w:cs="Times New Roman"/>
+          <w:bCs/>
+          <w:sz w:val="24"/>
+          <w:szCs w:val="24"/>
+        </w:rPr>
+        <w:t xml:space="preserve"> screenshot of the </w:t>
       </w:r>
       <w:proofErr w:type="spellStart"/>
       <w:r>
@@ -2021,6 +2251,17 @@
         </w:rPr>
         <w:t xml:space="preserve"> methods in the Utility class.</w:t>
       </w:r>
+    </w:p>
+    <w:p>
+      <w:pPr>
+        <w:pStyle w:val="PlainText"/>
+        <w:rPr>
+          <w:rFonts w:ascii="Times New Roman" w:eastAsia="Calibri" w:hAnsi="Times New Roman" w:cs="Times New Roman"/>
+          <w:bCs/>
+          <w:sz w:val="24"/>
+          <w:szCs w:val="24"/>
+        </w:rPr>
+      </w:pPr>
     </w:p>
     <w:p>
       <w:pPr>
@@ -2055,7 +2296,7 @@
                     <pic:cNvPicPr/>
                   </pic:nvPicPr>
                   <pic:blipFill>
-                    <a:blip r:embed="rId20"/>
+                    <a:blip r:embed="rId21"/>
                     <a:stretch>
                       <a:fillRect/>
                     </a:stretch>
@@ -2121,7 +2362,7 @@
                     <pic:cNvPicPr/>
                   </pic:nvPicPr>
                   <pic:blipFill>
-                    <a:blip r:embed="rId21"/>
+                    <a:blip r:embed="rId22"/>
                     <a:stretch>
                       <a:fillRect/>
                     </a:stretch>
@@ -2163,10 +2404,25 @@
           <w:szCs w:val="24"/>
         </w:rPr>
       </w:pPr>
-      <w:r>
-        <w:rPr>
-          <w:rFonts w:ascii="Times New Roman" w:eastAsia="Calibri" w:hAnsi="Times New Roman" w:cs="Times New Roman"/>
-          <w:bCs/>
+    </w:p>
+    <w:p>
+      <w:pPr>
+        <w:pStyle w:val="PlainText"/>
+        <w:rPr>
+          <w:rFonts w:ascii="Times New Roman" w:eastAsia="Calibri" w:hAnsi="Times New Roman" w:cs="Times New Roman"/>
+          <w:b/>
+          <w:i/>
+          <w:iCs/>
+          <w:sz w:val="24"/>
+          <w:szCs w:val="24"/>
+        </w:rPr>
+      </w:pPr>
+      <w:r>
+        <w:rPr>
+          <w:rFonts w:ascii="Times New Roman" w:eastAsia="Calibri" w:hAnsi="Times New Roman" w:cs="Times New Roman"/>
+          <w:b/>
+          <w:i/>
+          <w:iCs/>
           <w:sz w:val="24"/>
           <w:szCs w:val="24"/>
         </w:rPr>
@@ -2201,79 +2457,538 @@
           <w:sz w:val="24"/>
           <w:szCs w:val="24"/>
         </w:rPr>
-        <w:t>The program works but is not yet finished. Here are some things you need to complete:</w:t>
-      </w:r>
-    </w:p>
-    <w:p>
-      <w:pPr>
-        <w:pStyle w:val="PlainText"/>
-        <w:rPr>
-          <w:rFonts w:ascii="Times New Roman" w:eastAsia="Calibri" w:hAnsi="Times New Roman" w:cs="Times New Roman"/>
-          <w:bCs/>
-          <w:sz w:val="24"/>
-          <w:szCs w:val="24"/>
-        </w:rPr>
-      </w:pPr>
-      <w:r>
-        <w:rPr>
-          <w:rFonts w:ascii="Times New Roman" w:eastAsia="Calibri" w:hAnsi="Times New Roman" w:cs="Times New Roman"/>
-          <w:bCs/>
-          <w:sz w:val="24"/>
-          <w:szCs w:val="24"/>
-        </w:rPr>
-        <w:t>1. Fix Out-of-Bounds Errors – Make sure that the user does not enter a number that is smaller or larger than the size of the grid.</w:t>
-      </w:r>
-    </w:p>
-    <w:p>
-      <w:pPr>
-        <w:pStyle w:val="PlainText"/>
-        <w:rPr>
-          <w:rFonts w:ascii="Times New Roman" w:eastAsia="Calibri" w:hAnsi="Times New Roman" w:cs="Times New Roman"/>
-          <w:bCs/>
-          <w:sz w:val="24"/>
-          <w:szCs w:val="24"/>
-        </w:rPr>
-      </w:pPr>
-      <w:r>
-        <w:rPr>
-          <w:rFonts w:ascii="Times New Roman" w:eastAsia="Calibri" w:hAnsi="Times New Roman" w:cs="Times New Roman"/>
-          <w:bCs/>
-          <w:sz w:val="24"/>
-          <w:szCs w:val="24"/>
-        </w:rPr>
-        <w:t>2. Fix Input Errors – The user is supposed to type in various information about the location and type of chess piece. If the user tries to put in letters or numbers outside of the acceptable options, the program will crash. Verify the input from the user before proceeding with the rest of the program.</w:t>
-      </w:r>
-    </w:p>
-    <w:p>
-      <w:pPr>
-        <w:pStyle w:val="PlainText"/>
-        <w:rPr>
-          <w:rFonts w:ascii="Times New Roman" w:eastAsia="Calibri" w:hAnsi="Times New Roman" w:cs="Times New Roman"/>
-          <w:bCs/>
-          <w:sz w:val="24"/>
-          <w:szCs w:val="24"/>
-        </w:rPr>
-      </w:pPr>
-      <w:r>
-        <w:rPr>
-          <w:rFonts w:ascii="Times New Roman" w:eastAsia="Calibri" w:hAnsi="Times New Roman" w:cs="Times New Roman"/>
-          <w:bCs/>
-          <w:sz w:val="24"/>
-          <w:szCs w:val="24"/>
-        </w:rPr>
-        <w:t>3. Board Printing Outlines – The program shows only a single character for each board cell. Modify the output to print a board outline like the example shown here in Figure 46. This shows outlines for each square, column headers, and row numbers.</w:t>
-      </w:r>
-    </w:p>
-    <w:p>
-      <w:pPr>
-        <w:pStyle w:val="PlainText"/>
-        <w:rPr>
-          <w:rFonts w:ascii="Times New Roman" w:eastAsia="Calibri" w:hAnsi="Times New Roman" w:cs="Times New Roman"/>
-          <w:bCs/>
-          <w:sz w:val="24"/>
-          <w:szCs w:val="24"/>
-        </w:rPr>
-      </w:pPr>
+        <w:t xml:space="preserve">I </w:t>
+      </w:r>
+      <w:r>
+        <w:rPr>
+          <w:rFonts w:ascii="Times New Roman" w:eastAsia="Calibri" w:hAnsi="Times New Roman" w:cs="Times New Roman"/>
+          <w:bCs/>
+          <w:sz w:val="24"/>
+          <w:szCs w:val="24"/>
+        </w:rPr>
+        <w:t>resolved the console challenges by:</w:t>
+      </w:r>
+    </w:p>
+    <w:p>
+      <w:pPr>
+        <w:pStyle w:val="PlainText"/>
+        <w:rPr>
+          <w:rFonts w:ascii="Times New Roman" w:eastAsia="Calibri" w:hAnsi="Times New Roman" w:cs="Times New Roman"/>
+          <w:bCs/>
+          <w:sz w:val="24"/>
+          <w:szCs w:val="24"/>
+        </w:rPr>
+      </w:pPr>
+    </w:p>
+    <w:p>
+      <w:pPr>
+        <w:pStyle w:val="PlainText"/>
+        <w:numPr>
+          <w:ilvl w:val="0"/>
+          <w:numId w:val="21"/>
+        </w:numPr>
+        <w:rPr>
+          <w:rFonts w:ascii="Times New Roman" w:eastAsia="Calibri" w:hAnsi="Times New Roman" w:cs="Times New Roman"/>
+          <w:bCs/>
+          <w:sz w:val="24"/>
+          <w:szCs w:val="24"/>
+        </w:rPr>
+      </w:pPr>
+      <w:r>
+        <w:rPr>
+          <w:rFonts w:ascii="Times New Roman" w:eastAsia="Calibri" w:hAnsi="Times New Roman" w:cs="Times New Roman"/>
+          <w:bCs/>
+          <w:sz w:val="24"/>
+          <w:szCs w:val="24"/>
+        </w:rPr>
+        <w:t xml:space="preserve">Validating user input using </w:t>
+      </w:r>
+      <w:proofErr w:type="spellStart"/>
+      <w:proofErr w:type="gramStart"/>
+      <w:r>
+        <w:rPr>
+          <w:rFonts w:ascii="Times New Roman" w:eastAsia="Calibri" w:hAnsi="Times New Roman" w:cs="Times New Roman"/>
+          <w:bCs/>
+          <w:sz w:val="24"/>
+          <w:szCs w:val="24"/>
+        </w:rPr>
+        <w:t>int.TryParse</w:t>
+      </w:r>
+      <w:proofErr w:type="spellEnd"/>
+      <w:proofErr w:type="gramEnd"/>
+      <w:r>
+        <w:rPr>
+          <w:rFonts w:ascii="Times New Roman" w:eastAsia="Calibri" w:hAnsi="Times New Roman" w:cs="Times New Roman"/>
+          <w:bCs/>
+          <w:sz w:val="24"/>
+          <w:szCs w:val="24"/>
+        </w:rPr>
+        <w:t xml:space="preserve"> and range checks to prevent crashes and out-of-</w:t>
+      </w:r>
+      <w:proofErr w:type="gramStart"/>
+      <w:r>
+        <w:rPr>
+          <w:rFonts w:ascii="Times New Roman" w:eastAsia="Calibri" w:hAnsi="Times New Roman" w:cs="Times New Roman"/>
+          <w:bCs/>
+          <w:sz w:val="24"/>
+          <w:szCs w:val="24"/>
+        </w:rPr>
+        <w:t>bounds</w:t>
+      </w:r>
+      <w:proofErr w:type="gramEnd"/>
+      <w:r>
+        <w:rPr>
+          <w:rFonts w:ascii="Times New Roman" w:eastAsia="Calibri" w:hAnsi="Times New Roman" w:cs="Times New Roman"/>
+          <w:bCs/>
+          <w:sz w:val="24"/>
+          <w:szCs w:val="24"/>
+        </w:rPr>
+        <w:t xml:space="preserve"> errors.</w:t>
+      </w:r>
+    </w:p>
+    <w:p>
+      <w:pPr>
+        <w:pStyle w:val="PlainText"/>
+        <w:numPr>
+          <w:ilvl w:val="0"/>
+          <w:numId w:val="21"/>
+        </w:numPr>
+        <w:rPr>
+          <w:rFonts w:ascii="Times New Roman" w:eastAsia="Calibri" w:hAnsi="Times New Roman" w:cs="Times New Roman"/>
+          <w:bCs/>
+          <w:sz w:val="24"/>
+          <w:szCs w:val="24"/>
+        </w:rPr>
+      </w:pPr>
+      <w:r>
+        <w:rPr>
+          <w:rFonts w:ascii="Times New Roman" w:eastAsia="Calibri" w:hAnsi="Times New Roman" w:cs="Times New Roman"/>
+          <w:bCs/>
+          <w:sz w:val="24"/>
+          <w:szCs w:val="24"/>
+        </w:rPr>
+        <w:t>Restricting piece selection to valid options (Knight, Rook, Bishop, Queen, King).</w:t>
+      </w:r>
+    </w:p>
+    <w:p>
+      <w:pPr>
+        <w:pStyle w:val="PlainText"/>
+        <w:numPr>
+          <w:ilvl w:val="0"/>
+          <w:numId w:val="21"/>
+        </w:numPr>
+        <w:rPr>
+          <w:rFonts w:ascii="Times New Roman" w:eastAsia="Calibri" w:hAnsi="Times New Roman" w:cs="Times New Roman"/>
+          <w:bCs/>
+          <w:sz w:val="24"/>
+          <w:szCs w:val="24"/>
+        </w:rPr>
+      </w:pPr>
+      <w:r>
+        <w:rPr>
+          <w:rFonts w:ascii="Times New Roman" w:eastAsia="Calibri" w:hAnsi="Times New Roman" w:cs="Times New Roman"/>
+          <w:bCs/>
+          <w:sz w:val="24"/>
+          <w:szCs w:val="24"/>
+        </w:rPr>
+        <w:t>Enhancing board output by formatting it with grid outlines, row numbers, and column headers for clearer display.</w:t>
+      </w:r>
+    </w:p>
+    <w:p>
+      <w:pPr>
+        <w:pStyle w:val="PlainText"/>
+        <w:rPr>
+          <w:rFonts w:ascii="Times New Roman" w:eastAsia="Calibri" w:hAnsi="Times New Roman" w:cs="Times New Roman"/>
+          <w:bCs/>
+          <w:sz w:val="24"/>
+          <w:szCs w:val="24"/>
+        </w:rPr>
+      </w:pPr>
+    </w:p>
+    <w:p>
+      <w:pPr>
+        <w:pStyle w:val="PlainText"/>
+        <w:rPr>
+          <w:rFonts w:ascii="Times New Roman" w:eastAsia="Calibri" w:hAnsi="Times New Roman" w:cs="Times New Roman"/>
+          <w:bCs/>
+          <w:sz w:val="24"/>
+          <w:szCs w:val="24"/>
+        </w:rPr>
+      </w:pPr>
+      <w:r>
+        <w:rPr>
+          <w:rFonts w:ascii="Times New Roman" w:eastAsia="Calibri" w:hAnsi="Times New Roman" w:cs="Times New Roman"/>
+          <w:bCs/>
+          <w:sz w:val="24"/>
+          <w:szCs w:val="24"/>
+        </w:rPr>
+        <w:t>Below are the</w:t>
+      </w:r>
+      <w:r>
+        <w:rPr>
+          <w:rFonts w:ascii="Times New Roman" w:eastAsia="Calibri" w:hAnsi="Times New Roman" w:cs="Times New Roman"/>
+          <w:bCs/>
+          <w:sz w:val="24"/>
+          <w:szCs w:val="24"/>
+        </w:rPr>
+        <w:t xml:space="preserve"> screenshot</w:t>
+      </w:r>
+      <w:r>
+        <w:rPr>
+          <w:rFonts w:ascii="Times New Roman" w:eastAsia="Calibri" w:hAnsi="Times New Roman" w:cs="Times New Roman"/>
+          <w:bCs/>
+          <w:sz w:val="24"/>
+          <w:szCs w:val="24"/>
+        </w:rPr>
+        <w:t>s</w:t>
+      </w:r>
+      <w:r>
+        <w:rPr>
+          <w:rFonts w:ascii="Times New Roman" w:eastAsia="Calibri" w:hAnsi="Times New Roman" w:cs="Times New Roman"/>
+          <w:bCs/>
+          <w:sz w:val="24"/>
+          <w:szCs w:val="24"/>
+        </w:rPr>
+        <w:t xml:space="preserve"> of each method added or updated to implement the features.</w:t>
+      </w:r>
+    </w:p>
+    <w:p>
+      <w:pPr>
+        <w:pStyle w:val="PlainText"/>
+        <w:rPr>
+          <w:rFonts w:ascii="Times New Roman" w:eastAsia="Calibri" w:hAnsi="Times New Roman" w:cs="Times New Roman"/>
+          <w:bCs/>
+          <w:sz w:val="24"/>
+          <w:szCs w:val="24"/>
+        </w:rPr>
+      </w:pPr>
+    </w:p>
+    <w:p>
+      <w:pPr>
+        <w:pStyle w:val="PlainText"/>
+        <w:rPr>
+          <w:rFonts w:ascii="Times New Roman" w:eastAsia="Calibri" w:hAnsi="Times New Roman" w:cs="Times New Roman"/>
+          <w:bCs/>
+          <w:sz w:val="24"/>
+          <w:szCs w:val="24"/>
+        </w:rPr>
+      </w:pPr>
+      <w:r>
+        <w:rPr>
+          <w:rFonts w:ascii="Times New Roman" w:eastAsia="Calibri" w:hAnsi="Times New Roman" w:cs="Times New Roman"/>
+          <w:bCs/>
+          <w:sz w:val="24"/>
+          <w:szCs w:val="24"/>
+        </w:rPr>
+        <w:drawing>
+          <wp:inline distT="0" distB="0" distL="0" distR="0" wp14:anchorId="4F6E9C38" wp14:editId="616BE1F0">
+            <wp:extent cx="4544059" cy="2124371"/>
+            <wp:effectExtent l="0" t="0" r="9525" b="9525"/>
+            <wp:docPr id="1584439222" name="Picture 1"/>
+            <wp:cNvGraphicFramePr>
+              <a:graphicFrameLocks xmlns:a="http://schemas.openxmlformats.org/drawingml/2006/main" noChangeAspect="1"/>
+            </wp:cNvGraphicFramePr>
+            <a:graphic xmlns:a="http://schemas.openxmlformats.org/drawingml/2006/main">
+              <a:graphicData uri="http://schemas.openxmlformats.org/drawingml/2006/picture">
+                <pic:pic xmlns:pic="http://schemas.openxmlformats.org/drawingml/2006/picture">
+                  <pic:nvPicPr>
+                    <pic:cNvPr id="1584439222" name=""/>
+                    <pic:cNvPicPr/>
+                  </pic:nvPicPr>
+                  <pic:blipFill>
+                    <a:blip r:embed="rId23"/>
+                    <a:stretch>
+                      <a:fillRect/>
+                    </a:stretch>
+                  </pic:blipFill>
+                  <pic:spPr>
+                    <a:xfrm>
+                      <a:off x="0" y="0"/>
+                      <a:ext cx="4544059" cy="2124371"/>
+                    </a:xfrm>
+                    <a:prstGeom prst="rect">
+                      <a:avLst/>
+                    </a:prstGeom>
+                  </pic:spPr>
+                </pic:pic>
+              </a:graphicData>
+            </a:graphic>
+          </wp:inline>
+        </w:drawing>
+      </w:r>
+    </w:p>
+    <w:p>
+      <w:pPr>
+        <w:pStyle w:val="PlainText"/>
+        <w:rPr>
+          <w:rFonts w:ascii="Times New Roman" w:eastAsia="Calibri" w:hAnsi="Times New Roman" w:cs="Times New Roman"/>
+          <w:bCs/>
+          <w:sz w:val="24"/>
+          <w:szCs w:val="24"/>
+        </w:rPr>
+      </w:pPr>
+    </w:p>
+    <w:p>
+      <w:pPr>
+        <w:pStyle w:val="PlainText"/>
+        <w:rPr>
+          <w:rFonts w:ascii="Times New Roman" w:eastAsia="Calibri" w:hAnsi="Times New Roman" w:cs="Times New Roman"/>
+          <w:bCs/>
+          <w:sz w:val="24"/>
+          <w:szCs w:val="24"/>
+        </w:rPr>
+      </w:pPr>
+      <w:r>
+        <w:rPr>
+          <w:rFonts w:ascii="Times New Roman" w:eastAsia="Calibri" w:hAnsi="Times New Roman" w:cs="Times New Roman"/>
+          <w:bCs/>
+          <w:sz w:val="24"/>
+          <w:szCs w:val="24"/>
+        </w:rPr>
+        <w:lastRenderedPageBreak/>
+        <w:drawing>
+          <wp:inline distT="0" distB="0" distL="0" distR="0" wp14:anchorId="4B0B637B" wp14:editId="6FCBADB1">
+            <wp:extent cx="4108450" cy="2880304"/>
+            <wp:effectExtent l="0" t="0" r="6350" b="0"/>
+            <wp:docPr id="87951529" name="Picture 1"/>
+            <wp:cNvGraphicFramePr>
+              <a:graphicFrameLocks xmlns:a="http://schemas.openxmlformats.org/drawingml/2006/main" noChangeAspect="1"/>
+            </wp:cNvGraphicFramePr>
+            <a:graphic xmlns:a="http://schemas.openxmlformats.org/drawingml/2006/main">
+              <a:graphicData uri="http://schemas.openxmlformats.org/drawingml/2006/picture">
+                <pic:pic xmlns:pic="http://schemas.openxmlformats.org/drawingml/2006/picture">
+                  <pic:nvPicPr>
+                    <pic:cNvPr id="87951529" name=""/>
+                    <pic:cNvPicPr/>
+                  </pic:nvPicPr>
+                  <pic:blipFill>
+                    <a:blip r:embed="rId24"/>
+                    <a:stretch>
+                      <a:fillRect/>
+                    </a:stretch>
+                  </pic:blipFill>
+                  <pic:spPr>
+                    <a:xfrm>
+                      <a:off x="0" y="0"/>
+                      <a:ext cx="4120784" cy="2888951"/>
+                    </a:xfrm>
+                    <a:prstGeom prst="rect">
+                      <a:avLst/>
+                    </a:prstGeom>
+                  </pic:spPr>
+                </pic:pic>
+              </a:graphicData>
+            </a:graphic>
+          </wp:inline>
+        </w:drawing>
+      </w:r>
+      <w:r>
+        <w:rPr>
+          <w:rFonts w:ascii="Times New Roman" w:eastAsia="Calibri" w:hAnsi="Times New Roman" w:cs="Times New Roman"/>
+          <w:bCs/>
+          <w:sz w:val="24"/>
+          <w:szCs w:val="24"/>
+        </w:rPr>
+        <w:br/>
+      </w:r>
+      <w:r>
+        <w:rPr>
+          <w:rFonts w:ascii="Times New Roman" w:eastAsia="Calibri" w:hAnsi="Times New Roman" w:cs="Times New Roman"/>
+          <w:bCs/>
+          <w:sz w:val="24"/>
+          <w:szCs w:val="24"/>
+        </w:rPr>
+        <w:br/>
+      </w:r>
+    </w:p>
+    <w:p>
+      <w:pPr>
+        <w:pStyle w:val="PlainText"/>
+        <w:rPr>
+          <w:rFonts w:ascii="Times New Roman" w:eastAsia="Calibri" w:hAnsi="Times New Roman" w:cs="Times New Roman"/>
+          <w:bCs/>
+          <w:sz w:val="24"/>
+          <w:szCs w:val="24"/>
+        </w:rPr>
+      </w:pPr>
+      <w:r>
+        <w:rPr>
+          <w:rFonts w:ascii="Times New Roman" w:eastAsia="Calibri" w:hAnsi="Times New Roman" w:cs="Times New Roman"/>
+          <w:bCs/>
+          <w:sz w:val="24"/>
+          <w:szCs w:val="24"/>
+        </w:rPr>
+        <w:drawing>
+          <wp:inline distT="0" distB="0" distL="0" distR="0" wp14:anchorId="71677D41" wp14:editId="49EC0DC7">
+            <wp:extent cx="4276089" cy="4578350"/>
+            <wp:effectExtent l="0" t="0" r="0" b="0"/>
+            <wp:docPr id="1403690659" name="Picture 1"/>
+            <wp:cNvGraphicFramePr>
+              <a:graphicFrameLocks xmlns:a="http://schemas.openxmlformats.org/drawingml/2006/main" noChangeAspect="1"/>
+            </wp:cNvGraphicFramePr>
+            <a:graphic xmlns:a="http://schemas.openxmlformats.org/drawingml/2006/main">
+              <a:graphicData uri="http://schemas.openxmlformats.org/drawingml/2006/picture">
+                <pic:pic xmlns:pic="http://schemas.openxmlformats.org/drawingml/2006/picture">
+                  <pic:nvPicPr>
+                    <pic:cNvPr id="1403690659" name=""/>
+                    <pic:cNvPicPr/>
+                  </pic:nvPicPr>
+                  <pic:blipFill>
+                    <a:blip r:embed="rId25"/>
+                    <a:stretch>
+                      <a:fillRect/>
+                    </a:stretch>
+                  </pic:blipFill>
+                  <pic:spPr>
+                    <a:xfrm>
+                      <a:off x="0" y="0"/>
+                      <a:ext cx="4294263" cy="4597808"/>
+                    </a:xfrm>
+                    <a:prstGeom prst="rect">
+                      <a:avLst/>
+                    </a:prstGeom>
+                  </pic:spPr>
+                </pic:pic>
+              </a:graphicData>
+            </a:graphic>
+          </wp:inline>
+        </w:drawing>
+      </w:r>
+    </w:p>
+    <w:p>
+      <w:pPr>
+        <w:pStyle w:val="PlainText"/>
+        <w:rPr>
+          <w:rFonts w:ascii="Times New Roman" w:eastAsia="Calibri" w:hAnsi="Times New Roman" w:cs="Times New Roman"/>
+          <w:bCs/>
+          <w:sz w:val="24"/>
+          <w:szCs w:val="24"/>
+        </w:rPr>
+      </w:pPr>
+    </w:p>
+    <w:p>
+      <w:pPr>
+        <w:pStyle w:val="PlainText"/>
+        <w:rPr>
+          <w:rFonts w:ascii="Times New Roman" w:eastAsia="Calibri" w:hAnsi="Times New Roman" w:cs="Times New Roman"/>
+          <w:bCs/>
+          <w:sz w:val="24"/>
+          <w:szCs w:val="24"/>
+        </w:rPr>
+      </w:pPr>
+    </w:p>
+    <w:p>
+      <w:pPr>
+        <w:pStyle w:val="PlainText"/>
+        <w:rPr>
+          <w:rFonts w:ascii="Times New Roman" w:eastAsia="Calibri" w:hAnsi="Times New Roman" w:cs="Times New Roman"/>
+          <w:bCs/>
+          <w:sz w:val="24"/>
+          <w:szCs w:val="24"/>
+        </w:rPr>
+      </w:pPr>
+      <w:r>
+        <w:rPr>
+          <w:rFonts w:ascii="Times New Roman" w:eastAsia="Calibri" w:hAnsi="Times New Roman" w:cs="Times New Roman"/>
+          <w:bCs/>
+          <w:sz w:val="24"/>
+          <w:szCs w:val="24"/>
+        </w:rPr>
+        <w:lastRenderedPageBreak/>
+        <w:t xml:space="preserve">Below is the </w:t>
+      </w:r>
+      <w:r>
+        <w:rPr>
+          <w:rFonts w:ascii="Times New Roman" w:eastAsia="Calibri" w:hAnsi="Times New Roman" w:cs="Times New Roman"/>
+          <w:bCs/>
+          <w:sz w:val="24"/>
+          <w:szCs w:val="24"/>
+        </w:rPr>
+        <w:t>application</w:t>
+      </w:r>
+      <w:r>
+        <w:rPr>
+          <w:rFonts w:ascii="Times New Roman" w:eastAsia="Calibri" w:hAnsi="Times New Roman" w:cs="Times New Roman"/>
+          <w:bCs/>
+          <w:sz w:val="24"/>
+          <w:szCs w:val="24"/>
+        </w:rPr>
+        <w:t xml:space="preserve"> being </w:t>
+      </w:r>
+      <w:r>
+        <w:rPr>
+          <w:rFonts w:ascii="Times New Roman" w:eastAsia="Calibri" w:hAnsi="Times New Roman" w:cs="Times New Roman"/>
+          <w:bCs/>
+          <w:sz w:val="24"/>
+          <w:szCs w:val="24"/>
+        </w:rPr>
+        <w:t>run</w:t>
+      </w:r>
+    </w:p>
+    <w:p>
+      <w:pPr>
+        <w:pStyle w:val="PlainText"/>
+        <w:rPr>
+          <w:rFonts w:ascii="Times New Roman" w:eastAsia="Calibri" w:hAnsi="Times New Roman" w:cs="Times New Roman"/>
+          <w:bCs/>
+          <w:sz w:val="24"/>
+          <w:szCs w:val="24"/>
+        </w:rPr>
+      </w:pPr>
+    </w:p>
+    <w:p>
+      <w:pPr>
+        <w:pStyle w:val="PlainText"/>
+        <w:rPr>
+          <w:rFonts w:ascii="Times New Roman" w:eastAsia="Calibri" w:hAnsi="Times New Roman" w:cs="Times New Roman"/>
+          <w:bCs/>
+          <w:sz w:val="24"/>
+          <w:szCs w:val="24"/>
+        </w:rPr>
+      </w:pPr>
+      <w:r>
+        <w:rPr>
+          <w:rFonts w:ascii="Times New Roman" w:eastAsia="Calibri" w:hAnsi="Times New Roman" w:cs="Times New Roman"/>
+          <w:bCs/>
+          <w:sz w:val="24"/>
+          <w:szCs w:val="24"/>
+        </w:rPr>
+        <w:drawing>
+          <wp:inline distT="0" distB="0" distL="0" distR="0" wp14:anchorId="323A4268" wp14:editId="00126CC6">
+            <wp:extent cx="3349630" cy="4394200"/>
+            <wp:effectExtent l="0" t="0" r="3175" b="6350"/>
+            <wp:docPr id="1465828760" name="Picture 1"/>
+            <wp:cNvGraphicFramePr>
+              <a:graphicFrameLocks xmlns:a="http://schemas.openxmlformats.org/drawingml/2006/main" noChangeAspect="1"/>
+            </wp:cNvGraphicFramePr>
+            <a:graphic xmlns:a="http://schemas.openxmlformats.org/drawingml/2006/main">
+              <a:graphicData uri="http://schemas.openxmlformats.org/drawingml/2006/picture">
+                <pic:pic xmlns:pic="http://schemas.openxmlformats.org/drawingml/2006/picture">
+                  <pic:nvPicPr>
+                    <pic:cNvPr id="1465828760" name=""/>
+                    <pic:cNvPicPr/>
+                  </pic:nvPicPr>
+                  <pic:blipFill>
+                    <a:blip r:embed="rId26"/>
+                    <a:stretch>
+                      <a:fillRect/>
+                    </a:stretch>
+                  </pic:blipFill>
+                  <pic:spPr>
+                    <a:xfrm>
+                      <a:off x="0" y="0"/>
+                      <a:ext cx="3367689" cy="4417891"/>
+                    </a:xfrm>
+                    <a:prstGeom prst="rect">
+                      <a:avLst/>
+                    </a:prstGeom>
+                  </pic:spPr>
+                </pic:pic>
+              </a:graphicData>
+            </a:graphic>
+          </wp:inline>
+        </w:drawing>
+      </w:r>
     </w:p>
     <w:sectPr>
       <w:pgSz w:w="12240" w:h="15840"/>
@@ -3714,6 +4429,119 @@
     </w:lvl>
   </w:abstractNum>
   <w:abstractNum w:abstractNumId="15" w15:restartNumberingAfterBreak="0">
+    <w:nsid w:val="68153541"/>
+    <w:multiLevelType w:val="hybridMultilevel"/>
+    <w:tmpl w:val="B5621A96"/>
+    <w:lvl w:ilvl="0" w:tplc="69E25CFC">
+      <w:start w:val="3"/>
+      <w:numFmt w:val="bullet"/>
+      <w:lvlText w:val="-"/>
+      <w:lvlJc w:val="left"/>
+      <w:pPr>
+        <w:ind w:left="720" w:hanging="360"/>
+      </w:pPr>
+      <w:rPr>
+        <w:rFonts w:ascii="Times New Roman" w:eastAsia="Calibri" w:hAnsi="Times New Roman" w:cs="Times New Roman" w:hint="default"/>
+      </w:rPr>
+    </w:lvl>
+    <w:lvl w:ilvl="1" w:tplc="04090003" w:tentative="1">
+      <w:start w:val="1"/>
+      <w:numFmt w:val="bullet"/>
+      <w:lvlText w:val="o"/>
+      <w:lvlJc w:val="left"/>
+      <w:pPr>
+        <w:ind w:left="1440" w:hanging="360"/>
+      </w:pPr>
+      <w:rPr>
+        <w:rFonts w:ascii="Courier New" w:hAnsi="Courier New" w:cs="Courier New" w:hint="default"/>
+      </w:rPr>
+    </w:lvl>
+    <w:lvl w:ilvl="2" w:tplc="04090005" w:tentative="1">
+      <w:start w:val="1"/>
+      <w:numFmt w:val="bullet"/>
+      <w:lvlText w:val=""/>
+      <w:lvlJc w:val="left"/>
+      <w:pPr>
+        <w:ind w:left="2160" w:hanging="360"/>
+      </w:pPr>
+      <w:rPr>
+        <w:rFonts w:ascii="Wingdings" w:hAnsi="Wingdings" w:hint="default"/>
+      </w:rPr>
+    </w:lvl>
+    <w:lvl w:ilvl="3" w:tplc="04090001" w:tentative="1">
+      <w:start w:val="1"/>
+      <w:numFmt w:val="bullet"/>
+      <w:lvlText w:val=""/>
+      <w:lvlJc w:val="left"/>
+      <w:pPr>
+        <w:ind w:left="2880" w:hanging="360"/>
+      </w:pPr>
+      <w:rPr>
+        <w:rFonts w:ascii="Symbol" w:hAnsi="Symbol" w:hint="default"/>
+      </w:rPr>
+    </w:lvl>
+    <w:lvl w:ilvl="4" w:tplc="04090003" w:tentative="1">
+      <w:start w:val="1"/>
+      <w:numFmt w:val="bullet"/>
+      <w:lvlText w:val="o"/>
+      <w:lvlJc w:val="left"/>
+      <w:pPr>
+        <w:ind w:left="3600" w:hanging="360"/>
+      </w:pPr>
+      <w:rPr>
+        <w:rFonts w:ascii="Courier New" w:hAnsi="Courier New" w:cs="Courier New" w:hint="default"/>
+      </w:rPr>
+    </w:lvl>
+    <w:lvl w:ilvl="5" w:tplc="04090005" w:tentative="1">
+      <w:start w:val="1"/>
+      <w:numFmt w:val="bullet"/>
+      <w:lvlText w:val=""/>
+      <w:lvlJc w:val="left"/>
+      <w:pPr>
+        <w:ind w:left="4320" w:hanging="360"/>
+      </w:pPr>
+      <w:rPr>
+        <w:rFonts w:ascii="Wingdings" w:hAnsi="Wingdings" w:hint="default"/>
+      </w:rPr>
+    </w:lvl>
+    <w:lvl w:ilvl="6" w:tplc="04090001" w:tentative="1">
+      <w:start w:val="1"/>
+      <w:numFmt w:val="bullet"/>
+      <w:lvlText w:val=""/>
+      <w:lvlJc w:val="left"/>
+      <w:pPr>
+        <w:ind w:left="5040" w:hanging="360"/>
+      </w:pPr>
+      <w:rPr>
+        <w:rFonts w:ascii="Symbol" w:hAnsi="Symbol" w:hint="default"/>
+      </w:rPr>
+    </w:lvl>
+    <w:lvl w:ilvl="7" w:tplc="04090003" w:tentative="1">
+      <w:start w:val="1"/>
+      <w:numFmt w:val="bullet"/>
+      <w:lvlText w:val="o"/>
+      <w:lvlJc w:val="left"/>
+      <w:pPr>
+        <w:ind w:left="5760" w:hanging="360"/>
+      </w:pPr>
+      <w:rPr>
+        <w:rFonts w:ascii="Courier New" w:hAnsi="Courier New" w:cs="Courier New" w:hint="default"/>
+      </w:rPr>
+    </w:lvl>
+    <w:lvl w:ilvl="8" w:tplc="04090005" w:tentative="1">
+      <w:start w:val="1"/>
+      <w:numFmt w:val="bullet"/>
+      <w:lvlText w:val=""/>
+      <w:lvlJc w:val="left"/>
+      <w:pPr>
+        <w:ind w:left="6480" w:hanging="360"/>
+      </w:pPr>
+      <w:rPr>
+        <w:rFonts w:ascii="Wingdings" w:hAnsi="Wingdings" w:hint="default"/>
+      </w:rPr>
+    </w:lvl>
+  </w:abstractNum>
+  <w:abstractNum w:abstractNumId="16" w15:restartNumberingAfterBreak="0">
     <w:nsid w:val="775C659F"/>
     <w:multiLevelType w:val="hybridMultilevel"/>
     <w:tmpl w:val="B09CF1FC"/>
@@ -3826,7 +4654,7 @@
       </w:rPr>
     </w:lvl>
   </w:abstractNum>
-  <w:abstractNum w:abstractNumId="16" w15:restartNumberingAfterBreak="0">
+  <w:abstractNum w:abstractNumId="17" w15:restartNumberingAfterBreak="0">
     <w:nsid w:val="79F44753"/>
     <w:multiLevelType w:val="hybridMultilevel"/>
     <w:tmpl w:val="379002D2"/>
@@ -3912,7 +4740,7 @@
       </w:pPr>
     </w:lvl>
   </w:abstractNum>
-  <w:abstractNum w:abstractNumId="17" w15:restartNumberingAfterBreak="0">
+  <w:abstractNum w:abstractNumId="18" w15:restartNumberingAfterBreak="0">
     <w:nsid w:val="7EF1444E"/>
     <w:multiLevelType w:val="hybridMultilevel"/>
     <w:tmpl w:val="379002D2"/>
@@ -4062,7 +4890,7 @@
     </w:lvlOverride>
   </w:num>
   <w:num w:numId="4" w16cid:durableId="1023020546">
-    <w:abstractNumId w:val="17"/>
+    <w:abstractNumId w:val="18"/>
     <w:lvlOverride w:ilvl="0">
       <w:startOverride w:val="1"/>
     </w:lvlOverride>
@@ -4095,7 +4923,7 @@
     <w:abstractNumId w:val="12"/>
   </w:num>
   <w:num w:numId="6" w16cid:durableId="281544093">
-    <w:abstractNumId w:val="16"/>
+    <w:abstractNumId w:val="17"/>
   </w:num>
   <w:num w:numId="7" w16cid:durableId="128480522">
     <w:abstractNumId w:val="8"/>
@@ -4188,10 +5016,13 @@
     <w:abstractNumId w:val="10"/>
   </w:num>
   <w:num w:numId="19" w16cid:durableId="1107428376">
-    <w:abstractNumId w:val="15"/>
+    <w:abstractNumId w:val="16"/>
   </w:num>
   <w:num w:numId="20" w16cid:durableId="1942488692">
     <w:abstractNumId w:val="5"/>
+  </w:num>
+  <w:num w:numId="21" w16cid:durableId="838891435">
+    <w:abstractNumId w:val="15"/>
   </w:num>
 </w:numbering>
 </file>
@@ -5461,4 +6292,16 @@
     </a:ext>
   </a:extLst>
 </a:theme>
+</file>
+
+<file path=customXml/item1.xml><?xml version="1.0" encoding="utf-8"?>
+<b:Sources xmlns:b="http://schemas.openxmlformats.org/officeDocument/2006/bibliography" xmlns="http://schemas.openxmlformats.org/officeDocument/2006/bibliography" SelectedStyle="\APASixthEditionOfficeOnline.xsl" StyleName="APA" Version="6"/>
+</file>
+
+<file path=customXml/itemProps1.xml><?xml version="1.0" encoding="utf-8"?>
+<ds:datastoreItem xmlns:ds="http://schemas.openxmlformats.org/officeDocument/2006/customXml" ds:itemID="{DF4E097B-65F4-4BF8-8C19-66F31B4B656E}">
+  <ds:schemaRefs>
+    <ds:schemaRef ds:uri="http://schemas.openxmlformats.org/officeDocument/2006/bibliography"/>
+  </ds:schemaRefs>
+</ds:datastoreItem>
 </file>
</xml_diff>